<commit_message>
Add experiment report docx
</commit_message>
<xml_diff>
--- a/高级程序设计实验报告（1）.docx
+++ b/高级程序设计实验报告（1）.docx
@@ -10,8 +10,6 @@
         <w:widowControl/>
         <w:suppressLineNumbers w:val="0"/>
       </w:pPr>
-      <w:bookmarkStart w:id="2" w:name="_GoBack"/>
-      <w:bookmarkEnd w:id="2"/>
     </w:p>
     <w:p>
       <w:pPr>
@@ -807,48 +805,6 @@
           <w:sz w:val="32"/>
           <w:szCs w:val="40"/>
         </w:rPr>
-        <w:tab/>
-      </w:r>
-      <w:r>
-        <w:rPr>
-          <w:sz w:val="32"/>
-          <w:szCs w:val="40"/>
-        </w:rPr>
-        <w:fldChar w:fldCharType="begin"/>
-      </w:r>
-      <w:r>
-        <w:rPr>
-          <w:sz w:val="32"/>
-          <w:szCs w:val="40"/>
-        </w:rPr>
-        <w:instrText xml:space="preserve"> PAGEREF _Toc21286 </w:instrText>
-      </w:r>
-      <w:r>
-        <w:rPr>
-          <w:sz w:val="32"/>
-          <w:szCs w:val="40"/>
-        </w:rPr>
-        <w:fldChar w:fldCharType="separate"/>
-      </w:r>
-      <w:r>
-        <w:rPr>
-          <w:sz w:val="32"/>
-          <w:szCs w:val="40"/>
-        </w:rPr>
-        <w:t>1</w:t>
-      </w:r>
-      <w:r>
-        <w:rPr>
-          <w:sz w:val="32"/>
-          <w:szCs w:val="40"/>
-        </w:rPr>
-        <w:fldChar w:fldCharType="end"/>
-      </w:r>
-      <w:r>
-        <w:rPr>
-          <w:sz w:val="32"/>
-          <w:szCs w:val="40"/>
-        </w:rPr>
         <w:fldChar w:fldCharType="end"/>
       </w:r>
     </w:p>
@@ -886,49 +842,16 @@
           <w:sz w:val="32"/>
           <w:szCs w:val="44"/>
         </w:rPr>
-        <w:t>作业题目</w:t>
-      </w:r>
-      <w:r>
-        <w:rPr>
+        <w:t>作业</w:t>
+      </w:r>
+      <w:r>
+        <w:rPr>
+          <w:rFonts w:hint="eastAsia"/>
           <w:sz w:val="32"/>
-          <w:szCs w:val="40"/>
-        </w:rPr>
-        <w:tab/>
-      </w:r>
-      <w:r>
-        <w:rPr>
-          <w:sz w:val="32"/>
-          <w:szCs w:val="40"/>
-        </w:rPr>
-        <w:fldChar w:fldCharType="begin"/>
-      </w:r>
-      <w:r>
-        <w:rPr>
-          <w:sz w:val="32"/>
-          <w:szCs w:val="40"/>
-        </w:rPr>
-        <w:instrText xml:space="preserve"> PAGEREF _Toc29969 </w:instrText>
-      </w:r>
-      <w:r>
-        <w:rPr>
-          <w:sz w:val="32"/>
-          <w:szCs w:val="40"/>
-        </w:rPr>
-        <w:fldChar w:fldCharType="separate"/>
-      </w:r>
-      <w:r>
-        <w:rPr>
-          <w:sz w:val="32"/>
-          <w:szCs w:val="40"/>
-        </w:rPr>
-        <w:t>1</w:t>
-      </w:r>
-      <w:r>
-        <w:rPr>
-          <w:sz w:val="32"/>
-          <w:szCs w:val="40"/>
-        </w:rPr>
-        <w:fldChar w:fldCharType="end"/>
+          <w:szCs w:val="44"/>
+          <w:lang w:val="en-US" w:eastAsia="zh-CN"/>
+        </w:rPr>
+        <w:t>题目</w:t>
       </w:r>
       <w:r>
         <w:rPr>
@@ -979,48 +902,6 @@
           <w:sz w:val="32"/>
           <w:szCs w:val="40"/>
         </w:rPr>
-        <w:tab/>
-      </w:r>
-      <w:r>
-        <w:rPr>
-          <w:sz w:val="32"/>
-          <w:szCs w:val="40"/>
-        </w:rPr>
-        <w:fldChar w:fldCharType="begin"/>
-      </w:r>
-      <w:r>
-        <w:rPr>
-          <w:sz w:val="32"/>
-          <w:szCs w:val="40"/>
-        </w:rPr>
-        <w:instrText xml:space="preserve"> PAGEREF _Toc18364 </w:instrText>
-      </w:r>
-      <w:r>
-        <w:rPr>
-          <w:sz w:val="32"/>
-          <w:szCs w:val="40"/>
-        </w:rPr>
-        <w:fldChar w:fldCharType="separate"/>
-      </w:r>
-      <w:r>
-        <w:rPr>
-          <w:sz w:val="32"/>
-          <w:szCs w:val="40"/>
-        </w:rPr>
-        <w:t>1</w:t>
-      </w:r>
-      <w:r>
-        <w:rPr>
-          <w:sz w:val="32"/>
-          <w:szCs w:val="40"/>
-        </w:rPr>
-        <w:fldChar w:fldCharType="end"/>
-      </w:r>
-      <w:r>
-        <w:rPr>
-          <w:sz w:val="32"/>
-          <w:szCs w:val="40"/>
-        </w:rPr>
         <w:fldChar w:fldCharType="end"/>
       </w:r>
     </w:p>
@@ -1065,48 +946,6 @@
           <w:sz w:val="32"/>
           <w:szCs w:val="40"/>
         </w:rPr>
-        <w:tab/>
-      </w:r>
-      <w:r>
-        <w:rPr>
-          <w:sz w:val="32"/>
-          <w:szCs w:val="40"/>
-        </w:rPr>
-        <w:fldChar w:fldCharType="begin"/>
-      </w:r>
-      <w:r>
-        <w:rPr>
-          <w:sz w:val="32"/>
-          <w:szCs w:val="40"/>
-        </w:rPr>
-        <w:instrText xml:space="preserve"> PAGEREF _Toc742 </w:instrText>
-      </w:r>
-      <w:r>
-        <w:rPr>
-          <w:sz w:val="32"/>
-          <w:szCs w:val="40"/>
-        </w:rPr>
-        <w:fldChar w:fldCharType="separate"/>
-      </w:r>
-      <w:r>
-        <w:rPr>
-          <w:sz w:val="32"/>
-          <w:szCs w:val="40"/>
-        </w:rPr>
-        <w:t>1</w:t>
-      </w:r>
-      <w:r>
-        <w:rPr>
-          <w:sz w:val="32"/>
-          <w:szCs w:val="40"/>
-        </w:rPr>
-        <w:fldChar w:fldCharType="end"/>
-      </w:r>
-      <w:r>
-        <w:rPr>
-          <w:sz w:val="32"/>
-          <w:szCs w:val="40"/>
-        </w:rPr>
         <w:fldChar w:fldCharType="end"/>
       </w:r>
     </w:p>
@@ -1151,48 +990,6 @@
           <w:sz w:val="32"/>
           <w:szCs w:val="40"/>
         </w:rPr>
-        <w:tab/>
-      </w:r>
-      <w:r>
-        <w:rPr>
-          <w:sz w:val="32"/>
-          <w:szCs w:val="40"/>
-        </w:rPr>
-        <w:fldChar w:fldCharType="begin"/>
-      </w:r>
-      <w:r>
-        <w:rPr>
-          <w:sz w:val="32"/>
-          <w:szCs w:val="40"/>
-        </w:rPr>
-        <w:instrText xml:space="preserve"> PAGEREF _Toc25240 </w:instrText>
-      </w:r>
-      <w:r>
-        <w:rPr>
-          <w:sz w:val="32"/>
-          <w:szCs w:val="40"/>
-        </w:rPr>
-        <w:fldChar w:fldCharType="separate"/>
-      </w:r>
-      <w:r>
-        <w:rPr>
-          <w:sz w:val="32"/>
-          <w:szCs w:val="40"/>
-        </w:rPr>
-        <w:t>1</w:t>
-      </w:r>
-      <w:r>
-        <w:rPr>
-          <w:sz w:val="32"/>
-          <w:szCs w:val="40"/>
-        </w:rPr>
-        <w:fldChar w:fldCharType="end"/>
-      </w:r>
-      <w:r>
-        <w:rPr>
-          <w:sz w:val="32"/>
-          <w:szCs w:val="40"/>
-        </w:rPr>
         <w:fldChar w:fldCharType="end"/>
       </w:r>
     </w:p>
@@ -1229,48 +1026,6 @@
           <w:sz w:val="32"/>
           <w:szCs w:val="40"/>
         </w:rPr>
-        <w:tab/>
-      </w:r>
-      <w:r>
-        <w:rPr>
-          <w:sz w:val="32"/>
-          <w:szCs w:val="40"/>
-        </w:rPr>
-        <w:fldChar w:fldCharType="begin"/>
-      </w:r>
-      <w:r>
-        <w:rPr>
-          <w:sz w:val="32"/>
-          <w:szCs w:val="40"/>
-        </w:rPr>
-        <w:instrText xml:space="preserve"> PAGEREF _Toc20452 </w:instrText>
-      </w:r>
-      <w:r>
-        <w:rPr>
-          <w:sz w:val="32"/>
-          <w:szCs w:val="40"/>
-        </w:rPr>
-        <w:fldChar w:fldCharType="separate"/>
-      </w:r>
-      <w:r>
-        <w:rPr>
-          <w:sz w:val="32"/>
-          <w:szCs w:val="40"/>
-        </w:rPr>
-        <w:t>2</w:t>
-      </w:r>
-      <w:r>
-        <w:rPr>
-          <w:sz w:val="32"/>
-          <w:szCs w:val="40"/>
-        </w:rPr>
-        <w:fldChar w:fldCharType="end"/>
-      </w:r>
-      <w:r>
-        <w:rPr>
-          <w:sz w:val="32"/>
-          <w:szCs w:val="40"/>
-        </w:rPr>
         <w:fldChar w:fldCharType="end"/>
       </w:r>
     </w:p>
@@ -1307,48 +1062,6 @@
           <w:sz w:val="32"/>
           <w:szCs w:val="40"/>
         </w:rPr>
-        <w:tab/>
-      </w:r>
-      <w:r>
-        <w:rPr>
-          <w:sz w:val="32"/>
-          <w:szCs w:val="40"/>
-        </w:rPr>
-        <w:fldChar w:fldCharType="begin"/>
-      </w:r>
-      <w:r>
-        <w:rPr>
-          <w:sz w:val="32"/>
-          <w:szCs w:val="40"/>
-        </w:rPr>
-        <w:instrText xml:space="preserve"> PAGEREF _Toc25354 </w:instrText>
-      </w:r>
-      <w:r>
-        <w:rPr>
-          <w:sz w:val="32"/>
-          <w:szCs w:val="40"/>
-        </w:rPr>
-        <w:fldChar w:fldCharType="separate"/>
-      </w:r>
-      <w:r>
-        <w:rPr>
-          <w:sz w:val="32"/>
-          <w:szCs w:val="40"/>
-        </w:rPr>
-        <w:t>2</w:t>
-      </w:r>
-      <w:r>
-        <w:rPr>
-          <w:sz w:val="32"/>
-          <w:szCs w:val="40"/>
-        </w:rPr>
-        <w:fldChar w:fldCharType="end"/>
-      </w:r>
-      <w:r>
-        <w:rPr>
-          <w:sz w:val="32"/>
-          <w:szCs w:val="40"/>
-        </w:rPr>
         <w:fldChar w:fldCharType="end"/>
       </w:r>
     </w:p>
@@ -1385,48 +1098,6 @@
           <w:sz w:val="32"/>
           <w:szCs w:val="40"/>
         </w:rPr>
-        <w:tab/>
-      </w:r>
-      <w:r>
-        <w:rPr>
-          <w:sz w:val="32"/>
-          <w:szCs w:val="40"/>
-        </w:rPr>
-        <w:fldChar w:fldCharType="begin"/>
-      </w:r>
-      <w:r>
-        <w:rPr>
-          <w:sz w:val="32"/>
-          <w:szCs w:val="40"/>
-        </w:rPr>
-        <w:instrText xml:space="preserve"> PAGEREF _Toc24674 </w:instrText>
-      </w:r>
-      <w:r>
-        <w:rPr>
-          <w:sz w:val="32"/>
-          <w:szCs w:val="40"/>
-        </w:rPr>
-        <w:fldChar w:fldCharType="separate"/>
-      </w:r>
-      <w:r>
-        <w:rPr>
-          <w:sz w:val="32"/>
-          <w:szCs w:val="40"/>
-        </w:rPr>
-        <w:t>3</w:t>
-      </w:r>
-      <w:r>
-        <w:rPr>
-          <w:sz w:val="32"/>
-          <w:szCs w:val="40"/>
-        </w:rPr>
-        <w:fldChar w:fldCharType="end"/>
-      </w:r>
-      <w:r>
-        <w:rPr>
-          <w:sz w:val="32"/>
-          <w:szCs w:val="40"/>
-        </w:rPr>
         <w:fldChar w:fldCharType="end"/>
       </w:r>
     </w:p>
@@ -1471,48 +1142,6 @@
           <w:sz w:val="32"/>
           <w:szCs w:val="40"/>
         </w:rPr>
-        <w:tab/>
-      </w:r>
-      <w:r>
-        <w:rPr>
-          <w:sz w:val="32"/>
-          <w:szCs w:val="40"/>
-        </w:rPr>
-        <w:fldChar w:fldCharType="begin"/>
-      </w:r>
-      <w:r>
-        <w:rPr>
-          <w:sz w:val="32"/>
-          <w:szCs w:val="40"/>
-        </w:rPr>
-        <w:instrText xml:space="preserve"> PAGEREF _Toc28265 </w:instrText>
-      </w:r>
-      <w:r>
-        <w:rPr>
-          <w:sz w:val="32"/>
-          <w:szCs w:val="40"/>
-        </w:rPr>
-        <w:fldChar w:fldCharType="separate"/>
-      </w:r>
-      <w:r>
-        <w:rPr>
-          <w:sz w:val="32"/>
-          <w:szCs w:val="40"/>
-        </w:rPr>
-        <w:t>3</w:t>
-      </w:r>
-      <w:r>
-        <w:rPr>
-          <w:sz w:val="32"/>
-          <w:szCs w:val="40"/>
-        </w:rPr>
-        <w:fldChar w:fldCharType="end"/>
-      </w:r>
-      <w:r>
-        <w:rPr>
-          <w:sz w:val="32"/>
-          <w:szCs w:val="40"/>
-        </w:rPr>
         <w:fldChar w:fldCharType="end"/>
       </w:r>
     </w:p>
@@ -1543,64 +1172,6 @@
         </w:rPr>
         <w:t>AI 工具使用披露</w:t>
       </w:r>
-      <w:r>
-        <w:fldChar w:fldCharType="begin"/>
-      </w:r>
-      <w:r>
-        <w:instrText xml:space="preserve"> HYPERLINK \l "_Toc23116" </w:instrText>
-      </w:r>
-      <w:r>
-        <w:fldChar w:fldCharType="separate"/>
-      </w:r>
-      <w:r>
-        <w:rPr>
-          <w:sz w:val="32"/>
-          <w:szCs w:val="40"/>
-        </w:rPr>
-        <w:tab/>
-      </w:r>
-      <w:r>
-        <w:rPr>
-          <w:sz w:val="32"/>
-          <w:szCs w:val="40"/>
-        </w:rPr>
-        <w:fldChar w:fldCharType="begin"/>
-      </w:r>
-      <w:r>
-        <w:rPr>
-          <w:sz w:val="32"/>
-          <w:szCs w:val="40"/>
-        </w:rPr>
-        <w:instrText xml:space="preserve"> PAGEREF _Toc23116 </w:instrText>
-      </w:r>
-      <w:r>
-        <w:rPr>
-          <w:sz w:val="32"/>
-          <w:szCs w:val="40"/>
-        </w:rPr>
-        <w:fldChar w:fldCharType="separate"/>
-      </w:r>
-      <w:r>
-        <w:rPr>
-          <w:sz w:val="32"/>
-          <w:szCs w:val="40"/>
-        </w:rPr>
-        <w:t>4</w:t>
-      </w:r>
-      <w:r>
-        <w:rPr>
-          <w:sz w:val="32"/>
-          <w:szCs w:val="40"/>
-        </w:rPr>
-        <w:fldChar w:fldCharType="end"/>
-      </w:r>
-      <w:r>
-        <w:rPr>
-          <w:sz w:val="32"/>
-          <w:szCs w:val="40"/>
-        </w:rPr>
-        <w:fldChar w:fldCharType="end"/>
-      </w:r>
     </w:p>
     <w:p>
       <w:pPr>
@@ -1646,48 +1217,6 @@
           <w:szCs w:val="44"/>
         </w:rPr>
         <w:t>收获</w:t>
-      </w:r>
-      <w:r>
-        <w:rPr>
-          <w:sz w:val="32"/>
-          <w:szCs w:val="40"/>
-        </w:rPr>
-        <w:tab/>
-      </w:r>
-      <w:r>
-        <w:rPr>
-          <w:sz w:val="32"/>
-          <w:szCs w:val="40"/>
-        </w:rPr>
-        <w:fldChar w:fldCharType="begin"/>
-      </w:r>
-      <w:r>
-        <w:rPr>
-          <w:sz w:val="32"/>
-          <w:szCs w:val="40"/>
-        </w:rPr>
-        <w:instrText xml:space="preserve"> PAGEREF _Toc23116 </w:instrText>
-      </w:r>
-      <w:r>
-        <w:rPr>
-          <w:sz w:val="32"/>
-          <w:szCs w:val="40"/>
-        </w:rPr>
-        <w:fldChar w:fldCharType="separate"/>
-      </w:r>
-      <w:r>
-        <w:rPr>
-          <w:sz w:val="32"/>
-          <w:szCs w:val="40"/>
-        </w:rPr>
-        <w:t>4</w:t>
-      </w:r>
-      <w:r>
-        <w:rPr>
-          <w:sz w:val="32"/>
-          <w:szCs w:val="40"/>
-        </w:rPr>
-        <w:fldChar w:fldCharType="end"/>
       </w:r>
       <w:r>
         <w:rPr>
@@ -2750,15 +2279,19 @@
         <w:jc w:val="left"/>
         <w:rPr>
           <w:rFonts w:hint="eastAsia" w:asciiTheme="majorEastAsia" w:hAnsiTheme="majorEastAsia" w:eastAsiaTheme="majorEastAsia" w:cstheme="majorEastAsia"/>
-          <w:kern w:val="0"/>
-          <w:sz w:val="24"/>
-          <w:szCs w:val="24"/>
-          <w:lang w:val="en-US" w:eastAsia="zh-CN" w:bidi="ar"/>
-        </w:rPr>
-      </w:pPr>
-      <w:r>
-        <w:rPr>
-          <w:rFonts w:hint="eastAsia" w:asciiTheme="majorEastAsia" w:hAnsiTheme="majorEastAsia" w:eastAsiaTheme="majorEastAsia" w:cstheme="majorEastAsia"/>
+          <w:b/>
+          <w:bCs/>
+          <w:kern w:val="0"/>
+          <w:sz w:val="24"/>
+          <w:szCs w:val="24"/>
+          <w:lang w:val="en-US" w:eastAsia="zh-CN" w:bidi="ar"/>
+        </w:rPr>
+      </w:pPr>
+      <w:r>
+        <w:rPr>
+          <w:rFonts w:hint="eastAsia" w:asciiTheme="majorEastAsia" w:hAnsiTheme="majorEastAsia" w:eastAsiaTheme="majorEastAsia" w:cstheme="majorEastAsia"/>
+          <w:b w:val="0"/>
+          <w:bCs w:val="0"/>
           <w:kern w:val="0"/>
           <w:sz w:val="28"/>
           <w:szCs w:val="28"/>
@@ -2769,12 +2302,26 @@
       <w:r>
         <w:rPr>
           <w:rFonts w:hint="eastAsia" w:asciiTheme="majorEastAsia" w:hAnsiTheme="majorEastAsia" w:eastAsiaTheme="majorEastAsia" w:cstheme="majorEastAsia"/>
-          <w:kern w:val="0"/>
-          <w:sz w:val="24"/>
-          <w:szCs w:val="24"/>
-          <w:lang w:val="en-US" w:eastAsia="zh-CN" w:bidi="ar"/>
-        </w:rPr>
-        <w:t>1）玩家移动算法</w:t>
+          <w:b w:val="0"/>
+          <w:bCs w:val="0"/>
+          <w:kern w:val="0"/>
+          <w:sz w:val="24"/>
+          <w:szCs w:val="24"/>
+          <w:lang w:val="en-US" w:eastAsia="zh-CN" w:bidi="ar"/>
+        </w:rPr>
+        <w:t>1）</w:t>
+      </w:r>
+      <w:r>
+        <w:rPr>
+          <w:rFonts w:hint="eastAsia" w:asciiTheme="majorEastAsia" w:hAnsiTheme="majorEastAsia" w:eastAsiaTheme="majorEastAsia" w:cstheme="majorEastAsia"/>
+          <w:b/>
+          <w:bCs/>
+          <w:kern w:val="0"/>
+          <w:sz w:val="24"/>
+          <w:szCs w:val="24"/>
+          <w:lang w:val="en-US" w:eastAsia="zh-CN" w:bidi="ar"/>
+        </w:rPr>
+        <w:t>玩家移动算法</w:t>
       </w:r>
     </w:p>
     <w:p>
@@ -2883,6 +2430,8 @@
       <w:r>
         <w:rPr>
           <w:rFonts w:hint="eastAsia" w:asciiTheme="majorEastAsia" w:hAnsiTheme="majorEastAsia" w:eastAsiaTheme="majorEastAsia" w:cstheme="majorEastAsia"/>
+          <w:b/>
+          <w:bCs/>
           <w:kern w:val="0"/>
           <w:sz w:val="24"/>
           <w:szCs w:val="24"/>
@@ -2906,19 +2455,515 @@
         <w:jc w:val="left"/>
         <w:rPr>
           <w:rFonts w:hint="eastAsia" w:asciiTheme="majorEastAsia" w:hAnsiTheme="majorEastAsia" w:eastAsiaTheme="majorEastAsia" w:cstheme="majorEastAsia"/>
-          <w:sz w:val="21"/>
-          <w:szCs w:val="24"/>
-        </w:rPr>
-      </w:pPr>
-      <w:r>
-        <w:rPr>
-          <w:rFonts w:hint="eastAsia" w:asciiTheme="majorEastAsia" w:hAnsiTheme="majorEastAsia" w:eastAsiaTheme="majorEastAsia" w:cstheme="majorEastAsia"/>
-          <w:kern w:val="0"/>
-          <w:sz w:val="24"/>
-          <w:szCs w:val="24"/>
-          <w:lang w:val="en-US" w:eastAsia="zh-CN" w:bidi="ar"/>
-        </w:rPr>
-        <w:t>采用 SFML 内置矩形相交检测，判断子弹与敌人、玩家与敌人、玩家与道具是否碰撞：rect1.intersects(rect2)，返回 true 表示发生碰撞，执行对应逻辑（受伤、拾取、销毁）。</w:t>
+          <w:kern w:val="0"/>
+          <w:sz w:val="24"/>
+          <w:szCs w:val="24"/>
+          <w:lang w:val="en-US" w:eastAsia="zh-CN" w:bidi="ar"/>
+        </w:rPr>
+      </w:pPr>
+      <w:r>
+        <w:rPr>
+          <w:rFonts w:hint="eastAsia" w:asciiTheme="majorEastAsia" w:hAnsiTheme="majorEastAsia" w:eastAsiaTheme="majorEastAsia" w:cstheme="majorEastAsia"/>
+          <w:kern w:val="0"/>
+          <w:sz w:val="24"/>
+          <w:szCs w:val="24"/>
+          <w:lang w:val="en-US" w:eastAsia="zh-CN" w:bidi="ar"/>
+        </w:rPr>
+        <w:t>本项目采用 AABB 轴对齐矩形碰撞检测，基于 SFML 内置函数sf::FloatRect::intersects() 实现。</w:t>
+      </w:r>
+    </w:p>
+    <w:p>
+      <w:pPr>
+        <w:keepNext w:val="0"/>
+        <w:keepLines w:val="0"/>
+        <w:widowControl/>
+        <w:numPr>
+          <w:ilvl w:val="0"/>
+          <w:numId w:val="0"/>
+        </w:numPr>
+        <w:suppressLineNumbers w:val="0"/>
+        <w:bidi w:val="0"/>
+        <w:spacing w:line="360" w:lineRule="auto"/>
+        <w:jc w:val="left"/>
+        <w:rPr>
+          <w:rFonts w:hint="eastAsia" w:asciiTheme="majorEastAsia" w:hAnsiTheme="majorEastAsia" w:eastAsiaTheme="majorEastAsia" w:cstheme="majorEastAsia"/>
+          <w:kern w:val="0"/>
+          <w:sz w:val="24"/>
+          <w:szCs w:val="24"/>
+          <w:lang w:val="en-US" w:eastAsia="zh-CN" w:bidi="ar"/>
+        </w:rPr>
+      </w:pPr>
+      <w:r>
+        <w:rPr>
+          <w:rFonts w:hint="eastAsia" w:asciiTheme="majorEastAsia" w:hAnsiTheme="majorEastAsia" w:eastAsiaTheme="majorEastAsia" w:cstheme="majorEastAsia"/>
+          <w:kern w:val="0"/>
+          <w:sz w:val="24"/>
+          <w:szCs w:val="24"/>
+          <w:lang w:val="en-US" w:eastAsia="zh-CN" w:bidi="ar"/>
+        </w:rPr>
+        <w:t xml:space="preserve">    A.原理</w:t>
+      </w:r>
+    </w:p>
+    <w:p>
+      <w:pPr>
+        <w:keepNext w:val="0"/>
+        <w:keepLines w:val="0"/>
+        <w:widowControl/>
+        <w:numPr>
+          <w:ilvl w:val="0"/>
+          <w:numId w:val="0"/>
+        </w:numPr>
+        <w:suppressLineNumbers w:val="0"/>
+        <w:bidi w:val="0"/>
+        <w:spacing w:line="360" w:lineRule="auto"/>
+        <w:jc w:val="left"/>
+        <w:rPr>
+          <w:rFonts w:hint="eastAsia" w:asciiTheme="majorEastAsia" w:hAnsiTheme="majorEastAsia" w:eastAsiaTheme="majorEastAsia" w:cstheme="majorEastAsia"/>
+          <w:kern w:val="0"/>
+          <w:sz w:val="24"/>
+          <w:szCs w:val="24"/>
+          <w:lang w:val="en-US" w:eastAsia="zh-CN" w:bidi="ar"/>
+        </w:rPr>
+      </w:pPr>
+      <w:r>
+        <w:rPr>
+          <w:rFonts w:hint="eastAsia" w:asciiTheme="majorEastAsia" w:hAnsiTheme="majorEastAsia" w:eastAsiaTheme="majorEastAsia" w:cstheme="majorEastAsia"/>
+          <w:kern w:val="0"/>
+          <w:sz w:val="24"/>
+          <w:szCs w:val="24"/>
+          <w:lang w:val="en-US" w:eastAsia="zh-CN" w:bidi="ar"/>
+        </w:rPr>
+        <w:t xml:space="preserve">    游戏中所有实体（玩家、敌人、子弹、道具）均使用矩形包围盒包裹自身纹理，矩形的位置和大小会跟随实体实时更新。当两个矩形的区域产生重叠时，判定为发生碰撞。</w:t>
+      </w:r>
+    </w:p>
+    <w:p>
+      <w:pPr>
+        <w:keepNext w:val="0"/>
+        <w:keepLines w:val="0"/>
+        <w:widowControl/>
+        <w:numPr>
+          <w:ilvl w:val="0"/>
+          <w:numId w:val="0"/>
+        </w:numPr>
+        <w:suppressLineNumbers w:val="0"/>
+        <w:bidi w:val="0"/>
+        <w:spacing w:line="360" w:lineRule="auto"/>
+        <w:jc w:val="left"/>
+        <w:rPr>
+          <w:rFonts w:hint="eastAsia" w:asciiTheme="majorEastAsia" w:hAnsiTheme="majorEastAsia" w:eastAsiaTheme="majorEastAsia" w:cstheme="majorEastAsia"/>
+          <w:kern w:val="0"/>
+          <w:sz w:val="24"/>
+          <w:szCs w:val="24"/>
+          <w:lang w:val="en-US" w:eastAsia="zh-CN" w:bidi="ar"/>
+        </w:rPr>
+      </w:pPr>
+      <w:r>
+        <w:rPr>
+          <w:rFonts w:hint="eastAsia" w:asciiTheme="majorEastAsia" w:hAnsiTheme="majorEastAsia" w:eastAsiaTheme="majorEastAsia" w:cstheme="majorEastAsia"/>
+          <w:kern w:val="0"/>
+          <w:sz w:val="24"/>
+          <w:szCs w:val="24"/>
+          <w:lang w:val="en-US" w:eastAsia="zh-CN" w:bidi="ar"/>
+        </w:rPr>
+        <w:t xml:space="preserve">    B.实现方法</w:t>
+      </w:r>
+    </w:p>
+    <w:p>
+      <w:pPr>
+        <w:keepNext w:val="0"/>
+        <w:keepLines w:val="0"/>
+        <w:widowControl/>
+        <w:numPr>
+          <w:ilvl w:val="0"/>
+          <w:numId w:val="0"/>
+        </w:numPr>
+        <w:suppressLineNumbers w:val="0"/>
+        <w:bidi w:val="0"/>
+        <w:spacing w:line="360" w:lineRule="auto"/>
+        <w:jc w:val="left"/>
+        <w:rPr>
+          <w:rFonts w:hint="default" w:asciiTheme="majorEastAsia" w:hAnsiTheme="majorEastAsia" w:eastAsiaTheme="majorEastAsia" w:cstheme="majorEastAsia"/>
+          <w:kern w:val="0"/>
+          <w:sz w:val="24"/>
+          <w:szCs w:val="24"/>
+          <w:lang w:val="en-US" w:eastAsia="zh-CN" w:bidi="ar"/>
+        </w:rPr>
+      </w:pPr>
+      <w:r>
+        <w:rPr>
+          <w:rFonts w:hint="eastAsia" w:asciiTheme="majorEastAsia" w:hAnsiTheme="majorEastAsia" w:eastAsiaTheme="majorEastAsia" w:cstheme="majorEastAsia"/>
+          <w:kern w:val="0"/>
+          <w:sz w:val="24"/>
+          <w:szCs w:val="24"/>
+          <w:lang w:val="en-US" w:eastAsia="zh-CN" w:bidi="ar"/>
+        </w:rPr>
+        <w:t xml:space="preserve">    ·调用 getGlobalBounds() 获取实体的实时矩形区域;</w:t>
+      </w:r>
+    </w:p>
+    <w:p>
+      <w:pPr>
+        <w:keepNext w:val="0"/>
+        <w:keepLines w:val="0"/>
+        <w:widowControl/>
+        <w:numPr>
+          <w:ilvl w:val="0"/>
+          <w:numId w:val="0"/>
+        </w:numPr>
+        <w:suppressLineNumbers w:val="0"/>
+        <w:bidi w:val="0"/>
+        <w:spacing w:line="360" w:lineRule="auto"/>
+        <w:jc w:val="left"/>
+        <w:rPr>
+          <w:rFonts w:hint="default" w:asciiTheme="majorEastAsia" w:hAnsiTheme="majorEastAsia" w:eastAsiaTheme="majorEastAsia" w:cstheme="majorEastAsia"/>
+          <w:kern w:val="0"/>
+          <w:sz w:val="24"/>
+          <w:szCs w:val="24"/>
+          <w:lang w:val="en-US" w:eastAsia="zh-CN" w:bidi="ar"/>
+        </w:rPr>
+      </w:pPr>
+      <w:r>
+        <w:rPr>
+          <w:rFonts w:hint="eastAsia" w:asciiTheme="majorEastAsia" w:hAnsiTheme="majorEastAsia" w:eastAsiaTheme="majorEastAsia" w:cstheme="majorEastAsia"/>
+          <w:kern w:val="0"/>
+          <w:sz w:val="24"/>
+          <w:szCs w:val="24"/>
+          <w:lang w:val="en-US" w:eastAsia="zh-CN" w:bidi="ar"/>
+        </w:rPr>
+        <w:t xml:space="preserve">    ·使用 rect1.intersects(rect2) 判断是否重叠;</w:t>
+      </w:r>
+    </w:p>
+    <w:p>
+      <w:pPr>
+        <w:keepNext w:val="0"/>
+        <w:keepLines w:val="0"/>
+        <w:widowControl/>
+        <w:numPr>
+          <w:ilvl w:val="0"/>
+          <w:numId w:val="0"/>
+        </w:numPr>
+        <w:suppressLineNumbers w:val="0"/>
+        <w:bidi w:val="0"/>
+        <w:spacing w:line="360" w:lineRule="auto"/>
+        <w:jc w:val="left"/>
+        <w:rPr>
+          <w:rFonts w:hint="eastAsia" w:asciiTheme="majorEastAsia" w:hAnsiTheme="majorEastAsia" w:eastAsiaTheme="majorEastAsia" w:cstheme="majorEastAsia"/>
+          <w:kern w:val="0"/>
+          <w:sz w:val="24"/>
+          <w:szCs w:val="24"/>
+          <w:lang w:val="en-US" w:eastAsia="zh-CN" w:bidi="ar"/>
+        </w:rPr>
+      </w:pPr>
+      <w:r>
+        <w:rPr>
+          <w:rFonts w:hint="eastAsia" w:asciiTheme="majorEastAsia" w:hAnsiTheme="majorEastAsia" w:eastAsiaTheme="majorEastAsia" w:cstheme="majorEastAsia"/>
+          <w:kern w:val="0"/>
+          <w:sz w:val="24"/>
+          <w:szCs w:val="24"/>
+          <w:lang w:val="en-US" w:eastAsia="zh-CN" w:bidi="ar"/>
+        </w:rPr>
+        <w:t xml:space="preserve">    ·返回 true 表示碰撞，false 表示未碰撞</w:t>
+      </w:r>
+    </w:p>
+    <w:p>
+      <w:pPr>
+        <w:keepNext w:val="0"/>
+        <w:keepLines w:val="0"/>
+        <w:widowControl/>
+        <w:numPr>
+          <w:ilvl w:val="0"/>
+          <w:numId w:val="4"/>
+        </w:numPr>
+        <w:suppressLineNumbers w:val="0"/>
+        <w:bidi w:val="0"/>
+        <w:spacing w:line="360" w:lineRule="auto"/>
+        <w:ind w:left="480" w:leftChars="0" w:firstLine="0" w:firstLineChars="0"/>
+        <w:jc w:val="left"/>
+        <w:rPr>
+          <w:rFonts w:hint="eastAsia" w:asciiTheme="majorEastAsia" w:hAnsiTheme="majorEastAsia" w:eastAsiaTheme="majorEastAsia" w:cstheme="majorEastAsia"/>
+          <w:kern w:val="0"/>
+          <w:sz w:val="24"/>
+          <w:szCs w:val="24"/>
+          <w:lang w:val="en-US" w:eastAsia="zh-CN" w:bidi="ar"/>
+        </w:rPr>
+      </w:pPr>
+      <w:r>
+        <w:rPr>
+          <w:rFonts w:hint="eastAsia" w:asciiTheme="majorEastAsia" w:hAnsiTheme="majorEastAsia" w:eastAsiaTheme="majorEastAsia" w:cstheme="majorEastAsia"/>
+          <w:kern w:val="0"/>
+          <w:sz w:val="24"/>
+          <w:szCs w:val="24"/>
+          <w:lang w:val="en-US" w:eastAsia="zh-CN" w:bidi="ar"/>
+        </w:rPr>
+        <w:t>碰撞分组与逻辑</w:t>
+      </w:r>
+    </w:p>
+    <w:p>
+      <w:pPr>
+        <w:keepNext w:val="0"/>
+        <w:keepLines w:val="0"/>
+        <w:widowControl/>
+        <w:numPr>
+          <w:numId w:val="0"/>
+        </w:numPr>
+        <w:suppressLineNumbers w:val="0"/>
+        <w:bidi w:val="0"/>
+        <w:spacing w:line="360" w:lineRule="auto"/>
+        <w:ind w:left="480" w:leftChars="0"/>
+        <w:jc w:val="left"/>
+        <w:rPr>
+          <w:rFonts w:hint="eastAsia" w:asciiTheme="majorEastAsia" w:hAnsiTheme="majorEastAsia" w:eastAsiaTheme="majorEastAsia" w:cstheme="majorEastAsia"/>
+          <w:kern w:val="0"/>
+          <w:sz w:val="24"/>
+          <w:szCs w:val="24"/>
+          <w:lang w:val="en-US" w:eastAsia="zh-CN" w:bidi="ar"/>
+        </w:rPr>
+      </w:pPr>
+      <w:r>
+        <w:rPr>
+          <w:rFonts w:hint="eastAsia" w:asciiTheme="majorEastAsia" w:hAnsiTheme="majorEastAsia" w:eastAsiaTheme="majorEastAsia" w:cstheme="majorEastAsia"/>
+          <w:kern w:val="0"/>
+          <w:sz w:val="24"/>
+          <w:szCs w:val="24"/>
+          <w:lang w:val="en-US" w:eastAsia="zh-CN" w:bidi="ar"/>
+        </w:rPr>
+        <w:t>·子弹 ↔ 敌人：敌人扣血 / 销毁，子弹消失，播放爆炸特效，增加分数</w:t>
+      </w:r>
+    </w:p>
+    <w:p>
+      <w:pPr>
+        <w:keepNext w:val="0"/>
+        <w:keepLines w:val="0"/>
+        <w:widowControl/>
+        <w:numPr>
+          <w:ilvl w:val="0"/>
+          <w:numId w:val="0"/>
+        </w:numPr>
+        <w:suppressLineNumbers w:val="0"/>
+        <w:bidi w:val="0"/>
+        <w:spacing w:line="360" w:lineRule="auto"/>
+        <w:jc w:val="left"/>
+        <w:rPr>
+          <w:rFonts w:hint="eastAsia" w:asciiTheme="majorEastAsia" w:hAnsiTheme="majorEastAsia" w:eastAsiaTheme="majorEastAsia" w:cstheme="majorEastAsia"/>
+          <w:kern w:val="0"/>
+          <w:sz w:val="24"/>
+          <w:szCs w:val="24"/>
+          <w:lang w:val="en-US" w:eastAsia="zh-CN" w:bidi="ar"/>
+        </w:rPr>
+      </w:pPr>
+      <w:r>
+        <w:rPr>
+          <w:rFonts w:hint="eastAsia" w:asciiTheme="majorEastAsia" w:hAnsiTheme="majorEastAsia" w:eastAsiaTheme="majorEastAsia" w:cstheme="majorEastAsia"/>
+          <w:kern w:val="0"/>
+          <w:sz w:val="24"/>
+          <w:szCs w:val="24"/>
+          <w:lang w:val="en-US" w:eastAsia="zh-CN" w:bidi="ar"/>
+        </w:rPr>
+        <w:t xml:space="preserve">    ·玩家 ↔ 敌人：玩家扣血，敌人销毁，播放受伤音效</w:t>
+      </w:r>
+    </w:p>
+    <w:p>
+      <w:pPr>
+        <w:keepNext w:val="0"/>
+        <w:keepLines w:val="0"/>
+        <w:widowControl/>
+        <w:numPr>
+          <w:ilvl w:val="0"/>
+          <w:numId w:val="0"/>
+        </w:numPr>
+        <w:suppressLineNumbers w:val="0"/>
+        <w:bidi w:val="0"/>
+        <w:spacing w:line="360" w:lineRule="auto"/>
+        <w:jc w:val="left"/>
+        <w:rPr>
+          <w:rFonts w:hint="eastAsia" w:asciiTheme="majorEastAsia" w:hAnsiTheme="majorEastAsia" w:eastAsiaTheme="majorEastAsia" w:cstheme="majorEastAsia"/>
+          <w:kern w:val="0"/>
+          <w:sz w:val="24"/>
+          <w:szCs w:val="24"/>
+          <w:lang w:val="en-US" w:eastAsia="zh-CN" w:bidi="ar"/>
+        </w:rPr>
+      </w:pPr>
+      <w:r>
+        <w:rPr>
+          <w:rFonts w:hint="eastAsia" w:asciiTheme="majorEastAsia" w:hAnsiTheme="majorEastAsia" w:eastAsiaTheme="majorEastAsia" w:cstheme="majorEastAsia"/>
+          <w:kern w:val="0"/>
+          <w:sz w:val="24"/>
+          <w:szCs w:val="24"/>
+          <w:lang w:val="en-US" w:eastAsia="zh-CN" w:bidi="ar"/>
+        </w:rPr>
+        <w:t xml:space="preserve">    ·玩家 ↔ 道具：玩家获得强化（加血、加子弹、加攻速），道具消失</w:t>
+      </w:r>
+    </w:p>
+    <w:p>
+      <w:pPr>
+        <w:keepNext w:val="0"/>
+        <w:keepLines w:val="0"/>
+        <w:widowControl/>
+        <w:numPr>
+          <w:ilvl w:val="0"/>
+          <w:numId w:val="5"/>
+        </w:numPr>
+        <w:suppressLineNumbers w:val="0"/>
+        <w:bidi w:val="0"/>
+        <w:spacing w:line="360" w:lineRule="auto"/>
+        <w:ind w:left="480" w:leftChars="0" w:firstLine="0" w:firstLineChars="0"/>
+        <w:jc w:val="left"/>
+        <w:rPr>
+          <w:rFonts w:hint="eastAsia" w:asciiTheme="majorEastAsia" w:hAnsiTheme="majorEastAsia" w:eastAsiaTheme="majorEastAsia" w:cstheme="majorEastAsia"/>
+          <w:kern w:val="0"/>
+          <w:sz w:val="24"/>
+          <w:szCs w:val="24"/>
+          <w:lang w:val="en-US" w:eastAsia="zh-CN" w:bidi="ar"/>
+        </w:rPr>
+      </w:pPr>
+      <w:r>
+        <w:rPr>
+          <w:rFonts w:hint="eastAsia" w:asciiTheme="majorEastAsia" w:hAnsiTheme="majorEastAsia" w:eastAsiaTheme="majorEastAsia" w:cstheme="majorEastAsia"/>
+          <w:kern w:val="0"/>
+          <w:sz w:val="24"/>
+          <w:szCs w:val="24"/>
+          <w:lang w:val="en-US" w:eastAsia="zh-CN" w:bidi="ar"/>
+        </w:rPr>
+        <w:t>核心代码逻辑</w:t>
+      </w:r>
+    </w:p>
+    <w:p>
+      <w:pPr>
+        <w:keepNext w:val="0"/>
+        <w:keepLines w:val="0"/>
+        <w:widowControl/>
+        <w:numPr>
+          <w:numId w:val="0"/>
+        </w:numPr>
+        <w:suppressLineNumbers w:val="0"/>
+        <w:bidi w:val="0"/>
+        <w:spacing w:line="360" w:lineRule="auto"/>
+        <w:ind w:left="480" w:leftChars="0"/>
+        <w:jc w:val="left"/>
+        <w:rPr>
+          <w:rFonts w:hint="default" w:eastAsia="等线" w:cs="等线" w:asciiTheme="minorAscii" w:hAnsiTheme="minorAscii"/>
+          <w:sz w:val="18"/>
+          <w:szCs w:val="18"/>
+        </w:rPr>
+      </w:pPr>
+      <w:r>
+        <w:rPr>
+          <w:rFonts w:hint="default" w:eastAsia="等线" w:cs="等线" w:asciiTheme="minorAscii" w:hAnsiTheme="minorAscii"/>
+          <w:sz w:val="18"/>
+          <w:szCs w:val="18"/>
+        </w:rPr>
+        <w:t xml:space="preserve">sf::FloatRect playerBounds = player.getGlobalBounds(); </w:t>
+      </w:r>
+    </w:p>
+    <w:p>
+      <w:pPr>
+        <w:keepNext w:val="0"/>
+        <w:keepLines w:val="0"/>
+        <w:widowControl/>
+        <w:numPr>
+          <w:numId w:val="0"/>
+        </w:numPr>
+        <w:suppressLineNumbers w:val="0"/>
+        <w:bidi w:val="0"/>
+        <w:spacing w:line="360" w:lineRule="auto"/>
+        <w:ind w:left="480" w:leftChars="0"/>
+        <w:jc w:val="left"/>
+        <w:rPr>
+          <w:rFonts w:hint="default" w:eastAsia="等线" w:cs="等线" w:asciiTheme="minorAscii" w:hAnsiTheme="minorAscii"/>
+          <w:sz w:val="18"/>
+          <w:szCs w:val="18"/>
+        </w:rPr>
+      </w:pPr>
+      <w:r>
+        <w:rPr>
+          <w:rFonts w:hint="default" w:eastAsia="等线" w:cs="等线" w:asciiTheme="minorAscii" w:hAnsiTheme="minorAscii"/>
+          <w:sz w:val="18"/>
+          <w:szCs w:val="18"/>
+        </w:rPr>
+        <w:t>sf::FloatRect enemyBounds = enemy.getGlobalBounds();</w:t>
+      </w:r>
+    </w:p>
+    <w:p>
+      <w:pPr>
+        <w:keepNext w:val="0"/>
+        <w:keepLines w:val="0"/>
+        <w:widowControl/>
+        <w:numPr>
+          <w:numId w:val="0"/>
+        </w:numPr>
+        <w:suppressLineNumbers w:val="0"/>
+        <w:bidi w:val="0"/>
+        <w:spacing w:line="360" w:lineRule="auto"/>
+        <w:ind w:left="480" w:leftChars="0"/>
+        <w:jc w:val="left"/>
+        <w:rPr>
+          <w:rFonts w:hint="default" w:eastAsia="等线" w:cs="等线" w:asciiTheme="minorAscii" w:hAnsiTheme="minorAscii"/>
+          <w:sz w:val="18"/>
+          <w:szCs w:val="18"/>
+        </w:rPr>
+      </w:pPr>
+      <w:r>
+        <w:rPr>
+          <w:rFonts w:hint="default" w:eastAsia="等线" w:cs="等线" w:asciiTheme="minorAscii" w:hAnsiTheme="minorAscii"/>
+          <w:sz w:val="18"/>
+          <w:szCs w:val="18"/>
+        </w:rPr>
+        <w:t xml:space="preserve"> if (playerBounds.intersects(enemyBounds)) { </w:t>
+      </w:r>
+    </w:p>
+    <w:p>
+      <w:pPr>
+        <w:keepNext w:val="0"/>
+        <w:keepLines w:val="0"/>
+        <w:widowControl/>
+        <w:numPr>
+          <w:numId w:val="0"/>
+        </w:numPr>
+        <w:suppressLineNumbers w:val="0"/>
+        <w:bidi w:val="0"/>
+        <w:spacing w:line="360" w:lineRule="auto"/>
+        <w:ind w:left="480" w:leftChars="0"/>
+        <w:jc w:val="left"/>
+        <w:rPr>
+          <w:rFonts w:hint="default" w:eastAsia="等线" w:cs="等线" w:asciiTheme="minorAscii" w:hAnsiTheme="minorAscii"/>
+          <w:sz w:val="18"/>
+          <w:szCs w:val="18"/>
+        </w:rPr>
+      </w:pPr>
+      <w:r>
+        <w:rPr>
+          <w:rFonts w:hint="default" w:eastAsia="等线" w:cs="等线" w:asciiTheme="minorAscii" w:hAnsiTheme="minorAscii"/>
+          <w:sz w:val="18"/>
+          <w:szCs w:val="18"/>
+        </w:rPr>
+        <w:t>// 执行受伤逻辑：玩家减血、敌人销毁</w:t>
+      </w:r>
+    </w:p>
+    <w:p>
+      <w:pPr>
+        <w:keepNext w:val="0"/>
+        <w:keepLines w:val="0"/>
+        <w:widowControl/>
+        <w:numPr>
+          <w:numId w:val="0"/>
+        </w:numPr>
+        <w:suppressLineNumbers w:val="0"/>
+        <w:bidi w:val="0"/>
+        <w:spacing w:line="360" w:lineRule="auto"/>
+        <w:ind w:left="480" w:leftChars="0"/>
+        <w:jc w:val="left"/>
+        <w:rPr>
+          <w:rFonts w:hint="default" w:asciiTheme="minorAscii" w:hAnsiTheme="minorAscii" w:eastAsiaTheme="majorEastAsia" w:cstheme="majorEastAsia"/>
+          <w:sz w:val="18"/>
+          <w:szCs w:val="18"/>
+        </w:rPr>
+      </w:pPr>
+      <w:r>
+        <w:rPr>
+          <w:rFonts w:hint="default" w:eastAsia="等线" w:cs="等线" w:asciiTheme="minorAscii" w:hAnsiTheme="minorAscii"/>
+          <w:sz w:val="18"/>
+          <w:szCs w:val="18"/>
+        </w:rPr>
+        <w:t xml:space="preserve"> }</w:t>
       </w:r>
     </w:p>
     <w:p>
@@ -2937,21 +2982,25 @@
         <w:jc w:val="left"/>
         <w:rPr>
           <w:rFonts w:hint="eastAsia" w:asciiTheme="majorEastAsia" w:hAnsiTheme="majorEastAsia" w:eastAsiaTheme="majorEastAsia" w:cstheme="majorEastAsia"/>
-          <w:kern w:val="0"/>
-          <w:sz w:val="24"/>
-          <w:szCs w:val="24"/>
-          <w:lang w:val="en-US" w:eastAsia="zh-CN" w:bidi="ar"/>
-        </w:rPr>
-      </w:pPr>
-      <w:r>
-        <w:rPr>
-          <w:rFonts w:hint="eastAsia" w:asciiTheme="majorEastAsia" w:hAnsiTheme="majorEastAsia" w:eastAsiaTheme="majorEastAsia" w:cstheme="majorEastAsia"/>
-          <w:kern w:val="0"/>
-          <w:sz w:val="24"/>
-          <w:szCs w:val="24"/>
-          <w:lang w:val="en-US" w:eastAsia="zh-CN" w:bidi="ar"/>
-        </w:rPr>
-        <w:t>敌人 / 子弹生成算法</w:t>
+          <w:b/>
+          <w:bCs/>
+          <w:kern w:val="0"/>
+          <w:sz w:val="24"/>
+          <w:szCs w:val="24"/>
+          <w:lang w:val="en-US" w:eastAsia="zh-CN" w:bidi="ar"/>
+        </w:rPr>
+      </w:pPr>
+      <w:r>
+        <w:rPr>
+          <w:rFonts w:hint="eastAsia" w:asciiTheme="majorEastAsia" w:hAnsiTheme="majorEastAsia" w:eastAsiaTheme="majorEastAsia" w:cstheme="majorEastAsia"/>
+          <w:b/>
+          <w:bCs/>
+          <w:kern w:val="0"/>
+          <w:sz w:val="24"/>
+          <w:szCs w:val="24"/>
+          <w:lang w:val="en-US" w:eastAsia="zh-CN" w:bidi="ar"/>
+        </w:rPr>
+        <w:t>敌人/子弹/道具生成算法</w:t>
       </w:r>
     </w:p>
     <w:p>
@@ -2970,20 +3019,665 @@
         <w:jc w:val="left"/>
         <w:rPr>
           <w:rFonts w:hint="eastAsia" w:asciiTheme="majorEastAsia" w:hAnsiTheme="majorEastAsia" w:eastAsiaTheme="majorEastAsia" w:cstheme="majorEastAsia"/>
+          <w:kern w:val="0"/>
+          <w:sz w:val="24"/>
+          <w:szCs w:val="24"/>
+          <w:lang w:val="en-US" w:eastAsia="zh-CN" w:bidi="ar"/>
+        </w:rPr>
+      </w:pPr>
+      <w:r>
+        <w:rPr>
+          <w:rFonts w:hint="eastAsia" w:asciiTheme="majorEastAsia" w:hAnsiTheme="majorEastAsia" w:eastAsiaTheme="majorEastAsia" w:cstheme="majorEastAsia"/>
+          <w:kern w:val="0"/>
+          <w:sz w:val="24"/>
+          <w:szCs w:val="24"/>
+          <w:lang w:val="en-US" w:eastAsia="zh-CN" w:bidi="ar"/>
+        </w:rPr>
+        <w:t xml:space="preserve">    A.原理</w:t>
+      </w:r>
+    </w:p>
+    <w:p>
+      <w:pPr>
+        <w:keepNext w:val="0"/>
+        <w:keepLines w:val="0"/>
+        <w:widowControl/>
+        <w:numPr>
+          <w:ilvl w:val="0"/>
+          <w:numId w:val="0"/>
+        </w:numPr>
+        <w:suppressLineNumbers w:val="0"/>
+        <w:bidi w:val="0"/>
+        <w:spacing w:line="360" w:lineRule="auto"/>
+        <w:ind w:leftChars="0"/>
+        <w:jc w:val="left"/>
+        <w:rPr>
+          <w:rFonts w:hint="eastAsia" w:asciiTheme="majorEastAsia" w:hAnsiTheme="majorEastAsia" w:eastAsiaTheme="majorEastAsia" w:cstheme="majorEastAsia"/>
+          <w:kern w:val="0"/>
+          <w:sz w:val="24"/>
+          <w:szCs w:val="24"/>
+          <w:lang w:val="en-US" w:eastAsia="zh-CN" w:bidi="ar"/>
+        </w:rPr>
+      </w:pPr>
+      <w:r>
+        <w:rPr>
+          <w:rFonts w:hint="eastAsia" w:asciiTheme="majorEastAsia" w:hAnsiTheme="majorEastAsia" w:eastAsiaTheme="majorEastAsia" w:cstheme="majorEastAsia"/>
+          <w:kern w:val="0"/>
+          <w:sz w:val="24"/>
+          <w:szCs w:val="24"/>
+          <w:lang w:val="en-US" w:eastAsia="zh-CN" w:bidi="ar"/>
+        </w:rPr>
+        <w:t xml:space="preserve">    使用 sf::Clock 或累计帧时间 dt 记录时间流逝，当累计时间达到设定的生成间隔时，执行一次生成逻辑，并重置计时器。</w:t>
+      </w:r>
+    </w:p>
+    <w:p>
+      <w:pPr>
+        <w:keepNext w:val="0"/>
+        <w:keepLines w:val="0"/>
+        <w:widowControl/>
+        <w:numPr>
+          <w:ilvl w:val="0"/>
+          <w:numId w:val="0"/>
+        </w:numPr>
+        <w:suppressLineNumbers w:val="0"/>
+        <w:bidi w:val="0"/>
+        <w:spacing w:line="360" w:lineRule="auto"/>
+        <w:ind w:leftChars="0"/>
+        <w:jc w:val="left"/>
+        <w:rPr>
+          <w:rFonts w:hint="eastAsia" w:asciiTheme="majorEastAsia" w:hAnsiTheme="majorEastAsia" w:eastAsiaTheme="majorEastAsia" w:cstheme="majorEastAsia"/>
+          <w:kern w:val="0"/>
+          <w:sz w:val="24"/>
+          <w:szCs w:val="24"/>
+          <w:lang w:val="en-US" w:eastAsia="zh-CN" w:bidi="ar"/>
+        </w:rPr>
+      </w:pPr>
+      <w:r>
+        <w:rPr>
+          <w:rFonts w:hint="eastAsia" w:asciiTheme="majorEastAsia" w:hAnsiTheme="majorEastAsia" w:eastAsiaTheme="majorEastAsia" w:cstheme="majorEastAsia"/>
+          <w:kern w:val="0"/>
+          <w:sz w:val="24"/>
+          <w:szCs w:val="24"/>
+          <w:lang w:val="en-US" w:eastAsia="zh-CN" w:bidi="ar"/>
+        </w:rPr>
+        <w:t xml:space="preserve">    B.实现方法</w:t>
+      </w:r>
+    </w:p>
+    <w:p>
+      <w:pPr>
+        <w:keepNext w:val="0"/>
+        <w:keepLines w:val="0"/>
+        <w:widowControl/>
+        <w:numPr>
+          <w:ilvl w:val="0"/>
+          <w:numId w:val="0"/>
+        </w:numPr>
+        <w:suppressLineNumbers w:val="0"/>
+        <w:bidi w:val="0"/>
+        <w:spacing w:line="360" w:lineRule="auto"/>
+        <w:ind w:leftChars="0" w:firstLine="480"/>
+        <w:jc w:val="left"/>
+        <w:rPr>
+          <w:rFonts w:hint="eastAsia" w:asciiTheme="majorEastAsia" w:hAnsiTheme="majorEastAsia" w:eastAsiaTheme="majorEastAsia" w:cstheme="majorEastAsia"/>
+          <w:kern w:val="0"/>
+          <w:sz w:val="24"/>
+          <w:szCs w:val="24"/>
+          <w:lang w:val="en-US" w:eastAsia="zh-CN" w:bidi="ar"/>
+        </w:rPr>
+      </w:pPr>
+      <w:r>
+        <w:rPr>
+          <w:rFonts w:hint="eastAsia" w:asciiTheme="majorEastAsia" w:hAnsiTheme="majorEastAsia" w:eastAsiaTheme="majorEastAsia" w:cstheme="majorEastAsia"/>
+          <w:kern w:val="0"/>
+          <w:sz w:val="24"/>
+          <w:szCs w:val="24"/>
+          <w:lang w:val="en-US" w:eastAsia="zh-CN" w:bidi="ar"/>
+        </w:rPr>
+        <w:t>·定义生成间隔：敌人 1.0 秒生成一个，道具 5 秒生成一个</w:t>
+      </w:r>
+    </w:p>
+    <w:p>
+      <w:pPr>
+        <w:keepNext w:val="0"/>
+        <w:keepLines w:val="0"/>
+        <w:widowControl/>
+        <w:numPr>
+          <w:ilvl w:val="0"/>
+          <w:numId w:val="0"/>
+        </w:numPr>
+        <w:suppressLineNumbers w:val="0"/>
+        <w:bidi w:val="0"/>
+        <w:spacing w:line="360" w:lineRule="auto"/>
+        <w:ind w:leftChars="0" w:firstLine="480"/>
+        <w:jc w:val="left"/>
+        <w:rPr>
+          <w:rFonts w:hint="default" w:asciiTheme="majorEastAsia" w:hAnsiTheme="majorEastAsia" w:eastAsiaTheme="majorEastAsia" w:cstheme="majorEastAsia"/>
+          <w:kern w:val="0"/>
+          <w:sz w:val="24"/>
+          <w:szCs w:val="24"/>
+          <w:lang w:val="en-US" w:eastAsia="zh-CN" w:bidi="ar"/>
+        </w:rPr>
+      </w:pPr>
+      <w:r>
+        <w:rPr>
+          <w:rFonts w:hint="eastAsia" w:asciiTheme="majorEastAsia" w:hAnsiTheme="majorEastAsia" w:eastAsiaTheme="majorEastAsia" w:cstheme="majorEastAsia"/>
+          <w:kern w:val="0"/>
+          <w:sz w:val="24"/>
+          <w:szCs w:val="24"/>
+          <w:lang w:val="en-US" w:eastAsia="zh-CN" w:bidi="ar"/>
+        </w:rPr>
+        <w:t>·每帧累加 deltaTime 时间</w:t>
+      </w:r>
+    </w:p>
+    <w:p>
+      <w:pPr>
+        <w:keepNext w:val="0"/>
+        <w:keepLines w:val="0"/>
+        <w:widowControl/>
+        <w:numPr>
+          <w:ilvl w:val="0"/>
+          <w:numId w:val="0"/>
+        </w:numPr>
+        <w:suppressLineNumbers w:val="0"/>
+        <w:bidi w:val="0"/>
+        <w:spacing w:line="360" w:lineRule="auto"/>
+        <w:ind w:leftChars="0"/>
+        <w:jc w:val="left"/>
+        <w:rPr>
+          <w:rFonts w:hint="default" w:asciiTheme="majorEastAsia" w:hAnsiTheme="majorEastAsia" w:eastAsiaTheme="majorEastAsia" w:cstheme="majorEastAsia"/>
+          <w:kern w:val="0"/>
+          <w:sz w:val="24"/>
+          <w:szCs w:val="24"/>
+          <w:lang w:val="en-US" w:eastAsia="zh-CN" w:bidi="ar"/>
+        </w:rPr>
+      </w:pPr>
+      <w:r>
+        <w:rPr>
+          <w:rFonts w:hint="eastAsia" w:asciiTheme="majorEastAsia" w:hAnsiTheme="majorEastAsia" w:eastAsiaTheme="majorEastAsia" w:cstheme="majorEastAsia"/>
+          <w:kern w:val="0"/>
+          <w:sz w:val="24"/>
+          <w:szCs w:val="24"/>
+          <w:lang w:val="en-US" w:eastAsia="zh-CN" w:bidi="ar"/>
+        </w:rPr>
+        <w:t xml:space="preserve">    ·时间达标 → 生成实体 → 重置计时器</w:t>
+      </w:r>
+    </w:p>
+    <w:p>
+      <w:pPr>
+        <w:keepNext w:val="0"/>
+        <w:keepLines w:val="0"/>
+        <w:widowControl/>
+        <w:numPr>
+          <w:ilvl w:val="0"/>
+          <w:numId w:val="0"/>
+        </w:numPr>
+        <w:suppressLineNumbers w:val="0"/>
+        <w:bidi w:val="0"/>
+        <w:spacing w:line="360" w:lineRule="auto"/>
+        <w:ind w:leftChars="0"/>
+        <w:jc w:val="left"/>
+        <w:rPr>
+          <w:rFonts w:hint="eastAsia" w:asciiTheme="majorEastAsia" w:hAnsiTheme="majorEastAsia" w:eastAsiaTheme="majorEastAsia" w:cstheme="majorEastAsia"/>
+          <w:kern w:val="0"/>
+          <w:sz w:val="24"/>
+          <w:szCs w:val="24"/>
+          <w:lang w:val="en-US" w:eastAsia="zh-CN" w:bidi="ar"/>
+        </w:rPr>
+      </w:pPr>
+      <w:r>
+        <w:rPr>
+          <w:rFonts w:hint="eastAsia" w:asciiTheme="majorEastAsia" w:hAnsiTheme="majorEastAsia" w:eastAsiaTheme="majorEastAsia" w:cstheme="majorEastAsia"/>
+          <w:kern w:val="0"/>
+          <w:sz w:val="24"/>
+          <w:szCs w:val="24"/>
+          <w:lang w:val="en-US" w:eastAsia="zh-CN" w:bidi="ar"/>
+        </w:rPr>
+        <w:t xml:space="preserve">    ·随机生成位置：水平方向随机，垂直方向从屏幕顶部出现</w:t>
+      </w:r>
+    </w:p>
+    <w:p>
+      <w:pPr>
+        <w:keepNext w:val="0"/>
+        <w:keepLines w:val="0"/>
+        <w:widowControl/>
+        <w:numPr>
+          <w:ilvl w:val="0"/>
+          <w:numId w:val="0"/>
+        </w:numPr>
+        <w:suppressLineNumbers w:val="0"/>
+        <w:bidi w:val="0"/>
+        <w:spacing w:line="360" w:lineRule="auto"/>
+        <w:ind w:leftChars="0"/>
+        <w:jc w:val="left"/>
+        <w:rPr>
+          <w:rFonts w:hint="eastAsia" w:asciiTheme="majorEastAsia" w:hAnsiTheme="majorEastAsia" w:eastAsiaTheme="majorEastAsia" w:cstheme="majorEastAsia"/>
+          <w:kern w:val="0"/>
+          <w:sz w:val="24"/>
+          <w:szCs w:val="24"/>
+          <w:lang w:val="en-US" w:eastAsia="zh-CN" w:bidi="ar"/>
+        </w:rPr>
+      </w:pPr>
+      <w:r>
+        <w:rPr>
+          <w:rFonts w:hint="eastAsia" w:asciiTheme="majorEastAsia" w:hAnsiTheme="majorEastAsia" w:eastAsiaTheme="majorEastAsia" w:cstheme="majorEastAsia"/>
+          <w:kern w:val="0"/>
+          <w:sz w:val="24"/>
+          <w:szCs w:val="24"/>
+          <w:lang w:val="en-US" w:eastAsia="zh-CN" w:bidi="ar"/>
+        </w:rPr>
+        <w:t xml:space="preserve">    C.优势</w:t>
+      </w:r>
+    </w:p>
+    <w:p>
+      <w:pPr>
+        <w:keepNext w:val="0"/>
+        <w:keepLines w:val="0"/>
+        <w:widowControl/>
+        <w:numPr>
+          <w:ilvl w:val="0"/>
+          <w:numId w:val="0"/>
+        </w:numPr>
+        <w:suppressLineNumbers w:val="0"/>
+        <w:bidi w:val="0"/>
+        <w:spacing w:line="360" w:lineRule="auto"/>
+        <w:ind w:leftChars="0"/>
+        <w:jc w:val="left"/>
+        <w:rPr>
+          <w:rFonts w:hint="default" w:asciiTheme="minorAscii" w:hAnsiTheme="minorAscii" w:eastAsiaTheme="majorEastAsia" w:cstheme="majorEastAsia"/>
+          <w:kern w:val="0"/>
+          <w:sz w:val="24"/>
+          <w:szCs w:val="24"/>
+          <w:lang w:val="en-US" w:eastAsia="zh-CN" w:bidi="ar"/>
+        </w:rPr>
+      </w:pPr>
+      <w:r>
+        <w:rPr>
+          <w:rFonts w:hint="eastAsia" w:asciiTheme="majorEastAsia" w:hAnsiTheme="majorEastAsia" w:eastAsiaTheme="majorEastAsia" w:cstheme="majorEastAsia"/>
+          <w:kern w:val="0"/>
+          <w:sz w:val="24"/>
+          <w:szCs w:val="24"/>
+          <w:lang w:val="en-US" w:eastAsia="zh-CN" w:bidi="ar"/>
+        </w:rPr>
+        <w:t xml:space="preserve">    ·</w:t>
+      </w:r>
+      <w:r>
+        <w:rPr>
+          <w:rFonts w:hint="default" w:asciiTheme="minorAscii" w:hAnsiTheme="minorAscii" w:eastAsiaTheme="majorEastAsia" w:cstheme="majorEastAsia"/>
+          <w:kern w:val="0"/>
+          <w:sz w:val="24"/>
+          <w:szCs w:val="24"/>
+          <w:lang w:val="en-US" w:eastAsia="zh-CN" w:bidi="ar"/>
+        </w:rPr>
+        <w:t>帧率不影响生成速度，游戏流畅稳定</w:t>
+      </w:r>
+    </w:p>
+    <w:p>
+      <w:pPr>
+        <w:keepNext w:val="0"/>
+        <w:keepLines w:val="0"/>
+        <w:widowControl/>
+        <w:numPr>
+          <w:ilvl w:val="0"/>
+          <w:numId w:val="0"/>
+        </w:numPr>
+        <w:suppressLineNumbers w:val="0"/>
+        <w:bidi w:val="0"/>
+        <w:spacing w:line="360" w:lineRule="auto"/>
+        <w:ind w:leftChars="0"/>
+        <w:jc w:val="left"/>
+        <w:rPr>
+          <w:rFonts w:hint="default" w:asciiTheme="minorAscii" w:hAnsiTheme="minorAscii" w:eastAsiaTheme="majorEastAsia" w:cstheme="majorEastAsia"/>
+          <w:kern w:val="0"/>
+          <w:sz w:val="24"/>
+          <w:szCs w:val="24"/>
+          <w:lang w:val="en-US" w:eastAsia="zh-CN" w:bidi="ar"/>
+        </w:rPr>
+      </w:pPr>
+      <w:r>
+        <w:rPr>
+          <w:rFonts w:hint="default" w:asciiTheme="minorAscii" w:hAnsiTheme="minorAscii" w:eastAsiaTheme="majorEastAsia" w:cstheme="majorEastAsia"/>
+          <w:kern w:val="0"/>
+          <w:sz w:val="24"/>
+          <w:szCs w:val="24"/>
+          <w:lang w:val="en-US" w:eastAsia="zh-CN" w:bidi="ar"/>
+        </w:rPr>
+        <w:t xml:space="preserve">    </w:t>
+      </w:r>
+      <w:r>
+        <w:rPr>
+          <w:rFonts w:hint="eastAsia" w:asciiTheme="minorAscii" w:hAnsiTheme="minorAscii" w:eastAsiaTheme="majorEastAsia" w:cstheme="majorEastAsia"/>
+          <w:kern w:val="0"/>
+          <w:sz w:val="24"/>
+          <w:szCs w:val="24"/>
+          <w:lang w:val="en-US" w:eastAsia="zh-CN" w:bidi="ar"/>
+        </w:rPr>
+        <w:t>·</w:t>
+      </w:r>
+      <w:r>
+        <w:rPr>
+          <w:rFonts w:hint="default" w:asciiTheme="minorAscii" w:hAnsiTheme="minorAscii" w:eastAsiaTheme="majorEastAsia" w:cstheme="majorEastAsia"/>
+          <w:kern w:val="0"/>
+          <w:sz w:val="24"/>
+          <w:szCs w:val="24"/>
+          <w:lang w:val="en-US" w:eastAsia="zh-CN" w:bidi="ar"/>
+        </w:rPr>
+        <w:t>可动态调整生成频率，实现难度递增</w:t>
+      </w:r>
+    </w:p>
+    <w:p>
+      <w:pPr>
+        <w:keepNext w:val="0"/>
+        <w:keepLines w:val="0"/>
+        <w:widowControl/>
+        <w:numPr>
+          <w:ilvl w:val="0"/>
+          <w:numId w:val="0"/>
+        </w:numPr>
+        <w:suppressLineNumbers w:val="0"/>
+        <w:bidi w:val="0"/>
+        <w:spacing w:line="360" w:lineRule="auto"/>
+        <w:ind w:leftChars="0"/>
+        <w:jc w:val="left"/>
+        <w:rPr>
+          <w:rFonts w:hint="eastAsia" w:asciiTheme="majorEastAsia" w:hAnsiTheme="majorEastAsia" w:eastAsiaTheme="majorEastAsia" w:cstheme="majorEastAsia"/>
+          <w:kern w:val="0"/>
+          <w:sz w:val="24"/>
+          <w:szCs w:val="24"/>
+          <w:lang w:val="en-US" w:eastAsia="zh-CN" w:bidi="ar"/>
+        </w:rPr>
+      </w:pPr>
+      <w:r>
+        <w:rPr>
+          <w:rFonts w:hint="default" w:asciiTheme="minorAscii" w:hAnsiTheme="minorAscii" w:eastAsiaTheme="majorEastAsia" w:cstheme="majorEastAsia"/>
+          <w:kern w:val="0"/>
+          <w:sz w:val="24"/>
+          <w:szCs w:val="24"/>
+          <w:lang w:val="en-US" w:eastAsia="zh-CN" w:bidi="ar"/>
+        </w:rPr>
+        <w:t xml:space="preserve">    </w:t>
+      </w:r>
+      <w:r>
+        <w:rPr>
+          <w:rFonts w:hint="eastAsia" w:asciiTheme="minorAscii" w:hAnsiTheme="minorAscii" w:eastAsiaTheme="majorEastAsia" w:cstheme="majorEastAsia"/>
+          <w:kern w:val="0"/>
+          <w:sz w:val="24"/>
+          <w:szCs w:val="24"/>
+          <w:lang w:val="en-US" w:eastAsia="zh-CN" w:bidi="ar"/>
+        </w:rPr>
+        <w:t>·</w:t>
+      </w:r>
+      <w:r>
+        <w:rPr>
+          <w:rFonts w:hint="default" w:asciiTheme="minorAscii" w:hAnsiTheme="minorAscii" w:eastAsiaTheme="majorEastAsia" w:cstheme="majorEastAsia"/>
+          <w:kern w:val="0"/>
+          <w:sz w:val="24"/>
+          <w:szCs w:val="24"/>
+          <w:lang w:val="en-US" w:eastAsia="zh-CN" w:bidi="ar"/>
+        </w:rPr>
+        <w:t>控制实体数量，避免内存占用过高</w:t>
+      </w:r>
+    </w:p>
+    <w:p>
+      <w:pPr>
+        <w:keepNext w:val="0"/>
+        <w:keepLines w:val="0"/>
+        <w:widowControl/>
+        <w:numPr>
+          <w:numId w:val="0"/>
+        </w:numPr>
+        <w:suppressLineNumbers w:val="0"/>
+        <w:bidi w:val="0"/>
+        <w:spacing w:line="360" w:lineRule="auto"/>
+        <w:ind w:left="480" w:leftChars="0"/>
+        <w:jc w:val="left"/>
+        <w:rPr>
+          <w:rFonts w:hint="eastAsia" w:asciiTheme="majorEastAsia" w:hAnsiTheme="majorEastAsia" w:eastAsiaTheme="majorEastAsia" w:cstheme="majorEastAsia"/>
+          <w:kern w:val="0"/>
+          <w:sz w:val="24"/>
+          <w:szCs w:val="24"/>
+          <w:lang w:val="en-US" w:eastAsia="zh-CN" w:bidi="ar"/>
+        </w:rPr>
+      </w:pPr>
+      <w:r>
+        <w:rPr>
+          <w:rFonts w:hint="eastAsia" w:asciiTheme="majorEastAsia" w:hAnsiTheme="majorEastAsia" w:eastAsiaTheme="majorEastAsia" w:cstheme="majorEastAsia"/>
+          <w:kern w:val="0"/>
+          <w:sz w:val="24"/>
+          <w:szCs w:val="24"/>
+          <w:lang w:val="en-US" w:eastAsia="zh-CN" w:bidi="ar"/>
+        </w:rPr>
+        <w:t>D.核心代码逻辑</w:t>
+      </w:r>
+    </w:p>
+    <w:p>
+      <w:pPr>
+        <w:keepNext w:val="0"/>
+        <w:keepLines w:val="0"/>
+        <w:widowControl/>
+        <w:numPr>
+          <w:numId w:val="0"/>
+        </w:numPr>
+        <w:suppressLineNumbers w:val="0"/>
+        <w:bidi w:val="0"/>
+        <w:spacing w:line="240" w:lineRule="auto"/>
+        <w:ind w:left="480" w:leftChars="0"/>
+        <w:jc w:val="left"/>
+        <w:rPr>
+          <w:rFonts w:hint="default" w:eastAsia="等线" w:cs="等线" w:asciiTheme="minorAscii" w:hAnsiTheme="minorAscii"/>
+          <w:kern w:val="0"/>
+          <w:sz w:val="18"/>
+          <w:szCs w:val="18"/>
+          <w:lang w:val="en-US" w:eastAsia="zh-CN" w:bidi="ar"/>
+        </w:rPr>
+      </w:pPr>
+      <w:r>
+        <w:rPr>
+          <w:rFonts w:hint="default" w:eastAsia="等线" w:cs="等线" w:asciiTheme="minorAscii" w:hAnsiTheme="minorAscii"/>
+          <w:kern w:val="0"/>
+          <w:sz w:val="18"/>
+          <w:szCs w:val="18"/>
+          <w:lang w:val="en-US" w:eastAsia="zh-CN" w:bidi="ar"/>
+        </w:rPr>
+        <w:t>spawnTimer += dt.asSeconds();</w:t>
+      </w:r>
+    </w:p>
+    <w:p>
+      <w:pPr>
+        <w:keepNext w:val="0"/>
+        <w:keepLines w:val="0"/>
+        <w:widowControl/>
+        <w:numPr>
+          <w:ilvl w:val="0"/>
+          <w:numId w:val="0"/>
+        </w:numPr>
+        <w:suppressLineNumbers w:val="0"/>
+        <w:bidi w:val="0"/>
+        <w:spacing w:line="240" w:lineRule="auto"/>
+        <w:ind w:firstLine="360" w:firstLineChars="200"/>
+        <w:jc w:val="left"/>
+        <w:rPr>
+          <w:rFonts w:hint="default" w:eastAsia="等线" w:cs="等线" w:asciiTheme="minorAscii" w:hAnsiTheme="minorAscii"/>
+          <w:kern w:val="0"/>
+          <w:sz w:val="18"/>
+          <w:szCs w:val="18"/>
+          <w:lang w:val="en-US" w:eastAsia="zh-CN" w:bidi="ar"/>
+        </w:rPr>
+      </w:pPr>
+    </w:p>
+    <w:p>
+      <w:pPr>
+        <w:keepNext w:val="0"/>
+        <w:keepLines w:val="0"/>
+        <w:widowControl/>
+        <w:numPr>
+          <w:ilvl w:val="0"/>
+          <w:numId w:val="0"/>
+        </w:numPr>
+        <w:suppressLineNumbers w:val="0"/>
+        <w:bidi w:val="0"/>
+        <w:spacing w:line="240" w:lineRule="auto"/>
+        <w:ind w:firstLine="360" w:firstLineChars="200"/>
+        <w:jc w:val="left"/>
+        <w:rPr>
+          <w:rFonts w:hint="default" w:eastAsia="等线" w:cs="等线" w:asciiTheme="minorAscii" w:hAnsiTheme="minorAscii"/>
+          <w:kern w:val="0"/>
+          <w:sz w:val="18"/>
+          <w:szCs w:val="18"/>
+          <w:lang w:val="en-US" w:eastAsia="zh-CN" w:bidi="ar"/>
+        </w:rPr>
+      </w:pPr>
+      <w:r>
+        <w:rPr>
+          <w:rFonts w:hint="default" w:eastAsia="等线" w:cs="等线" w:asciiTheme="minorAscii" w:hAnsiTheme="minorAscii"/>
+          <w:kern w:val="0"/>
+          <w:sz w:val="18"/>
+          <w:szCs w:val="18"/>
+          <w:lang w:val="en-US" w:eastAsia="zh-CN" w:bidi="ar"/>
+        </w:rPr>
+        <w:t>if (spawnTimer &gt;= 1.0f) {</w:t>
+      </w:r>
+    </w:p>
+    <w:p>
+      <w:pPr>
+        <w:keepNext w:val="0"/>
+        <w:keepLines w:val="0"/>
+        <w:widowControl/>
+        <w:numPr>
+          <w:ilvl w:val="0"/>
+          <w:numId w:val="0"/>
+        </w:numPr>
+        <w:suppressLineNumbers w:val="0"/>
+        <w:bidi w:val="0"/>
+        <w:spacing w:line="240" w:lineRule="auto"/>
+        <w:ind w:firstLine="360" w:firstLineChars="200"/>
+        <w:jc w:val="left"/>
+        <w:rPr>
+          <w:rFonts w:hint="default" w:eastAsia="等线" w:cs="等线" w:asciiTheme="minorAscii" w:hAnsiTheme="minorAscii"/>
+          <w:kern w:val="0"/>
+          <w:sz w:val="18"/>
+          <w:szCs w:val="18"/>
+          <w:lang w:val="en-US" w:eastAsia="zh-CN" w:bidi="ar"/>
+        </w:rPr>
+      </w:pPr>
+      <w:r>
+        <w:rPr>
+          <w:rFonts w:hint="default" w:eastAsia="等线" w:cs="等线" w:asciiTheme="minorAscii" w:hAnsiTheme="minorAscii"/>
+          <w:kern w:val="0"/>
+          <w:sz w:val="18"/>
+          <w:szCs w:val="18"/>
+          <w:lang w:val="en-US" w:eastAsia="zh-CN" w:bidi="ar"/>
+        </w:rPr>
+        <w:t>spawnEnemy();       // 生成敌人</w:t>
+      </w:r>
+    </w:p>
+    <w:p>
+      <w:pPr>
+        <w:keepNext w:val="0"/>
+        <w:keepLines w:val="0"/>
+        <w:widowControl/>
+        <w:numPr>
+          <w:ilvl w:val="0"/>
+          <w:numId w:val="0"/>
+        </w:numPr>
+        <w:suppressLineNumbers w:val="0"/>
+        <w:bidi w:val="0"/>
+        <w:spacing w:line="240" w:lineRule="auto"/>
+        <w:ind w:firstLine="360" w:firstLineChars="200"/>
+        <w:jc w:val="left"/>
+        <w:rPr>
+          <w:rFonts w:hint="default" w:eastAsia="等线" w:cs="等线" w:asciiTheme="minorAscii" w:hAnsiTheme="minorAscii"/>
+          <w:kern w:val="0"/>
+          <w:sz w:val="18"/>
+          <w:szCs w:val="18"/>
+          <w:lang w:val="en-US" w:eastAsia="zh-CN" w:bidi="ar"/>
+        </w:rPr>
+      </w:pPr>
+      <w:r>
+        <w:rPr>
+          <w:rFonts w:hint="default" w:eastAsia="等线" w:cs="等线" w:asciiTheme="minorAscii" w:hAnsiTheme="minorAscii"/>
+          <w:kern w:val="0"/>
+          <w:sz w:val="18"/>
+          <w:szCs w:val="18"/>
+          <w:lang w:val="en-US" w:eastAsia="zh-CN" w:bidi="ar"/>
+        </w:rPr>
+        <w:t>spawnTimer = 0.0f;  // 重置计时器</w:t>
+      </w:r>
+    </w:p>
+    <w:p>
+      <w:pPr>
+        <w:keepNext w:val="0"/>
+        <w:keepLines w:val="0"/>
+        <w:widowControl/>
+        <w:numPr>
+          <w:ilvl w:val="0"/>
+          <w:numId w:val="0"/>
+        </w:numPr>
+        <w:suppressLineNumbers w:val="0"/>
+        <w:bidi w:val="0"/>
+        <w:spacing w:line="240" w:lineRule="auto"/>
+        <w:ind w:leftChars="0" w:firstLine="360" w:firstLineChars="200"/>
+        <w:jc w:val="left"/>
+        <w:rPr>
+          <w:rFonts w:hint="default" w:eastAsia="等线" w:cs="等线" w:asciiTheme="minorAscii" w:hAnsiTheme="minorAscii"/>
+          <w:kern w:val="0"/>
+          <w:sz w:val="18"/>
+          <w:szCs w:val="18"/>
+          <w:lang w:val="en-US" w:eastAsia="zh-CN" w:bidi="ar"/>
+        </w:rPr>
+      </w:pPr>
+      <w:r>
+        <w:rPr>
+          <w:rFonts w:hint="default" w:eastAsia="等线" w:cs="等线" w:asciiTheme="minorAscii" w:hAnsiTheme="minorAscii"/>
+          <w:kern w:val="0"/>
+          <w:sz w:val="18"/>
+          <w:szCs w:val="18"/>
+          <w:lang w:val="en-US" w:eastAsia="zh-CN" w:bidi="ar"/>
+        </w:rPr>
+        <w:t>}</w:t>
+      </w:r>
+    </w:p>
+    <w:p>
+      <w:pPr>
+        <w:keepNext w:val="0"/>
+        <w:keepLines w:val="0"/>
+        <w:widowControl/>
+        <w:numPr>
+          <w:ilvl w:val="0"/>
+          <w:numId w:val="0"/>
+        </w:numPr>
+        <w:suppressLineNumbers w:val="0"/>
+        <w:bidi w:val="0"/>
+        <w:spacing w:line="360" w:lineRule="auto"/>
+        <w:ind w:leftChars="0"/>
+        <w:jc w:val="left"/>
+        <w:rPr>
+          <w:rFonts w:hint="eastAsia" w:asciiTheme="majorEastAsia" w:hAnsiTheme="majorEastAsia" w:eastAsiaTheme="majorEastAsia" w:cstheme="majorEastAsia"/>
+          <w:kern w:val="0"/>
+          <w:sz w:val="24"/>
+          <w:szCs w:val="24"/>
+          <w:lang w:val="en-US" w:eastAsia="zh-CN" w:bidi="ar"/>
+        </w:rPr>
+      </w:pPr>
+    </w:p>
+    <w:p>
+      <w:pPr>
+        <w:keepNext w:val="0"/>
+        <w:keepLines w:val="0"/>
+        <w:widowControl/>
+        <w:numPr>
+          <w:ilvl w:val="0"/>
+          <w:numId w:val="0"/>
+        </w:numPr>
+        <w:suppressLineNumbers w:val="0"/>
+        <w:bidi w:val="0"/>
+        <w:spacing w:line="360" w:lineRule="auto"/>
+        <w:ind w:leftChars="0"/>
+        <w:jc w:val="left"/>
+        <w:rPr>
+          <w:rFonts w:hint="eastAsia" w:asciiTheme="majorEastAsia" w:hAnsiTheme="majorEastAsia" w:eastAsiaTheme="majorEastAsia" w:cstheme="majorEastAsia"/>
           <w:sz w:val="21"/>
           <w:szCs w:val="24"/>
         </w:rPr>
       </w:pPr>
-      <w:r>
-        <w:rPr>
-          <w:rFonts w:hint="eastAsia" w:asciiTheme="majorEastAsia" w:hAnsiTheme="majorEastAsia" w:eastAsiaTheme="majorEastAsia" w:cstheme="majorEastAsia"/>
-          <w:kern w:val="0"/>
-          <w:sz w:val="24"/>
-          <w:szCs w:val="24"/>
-          <w:lang w:val="en-US" w:eastAsia="zh-CN" w:bidi="ar"/>
-        </w:rPr>
-        <w:t>按固定时间间隔生成敌人、道具，计时器控制频率，避免资源过载。</w:t>
-      </w:r>
     </w:p>
     <w:p>
       <w:pPr>
@@ -3001,15 +3695,19 @@
         <w:jc w:val="left"/>
         <w:rPr>
           <w:rFonts w:hint="eastAsia" w:asciiTheme="majorEastAsia" w:hAnsiTheme="majorEastAsia" w:eastAsiaTheme="majorEastAsia" w:cstheme="majorEastAsia"/>
-          <w:kern w:val="0"/>
-          <w:sz w:val="24"/>
-          <w:szCs w:val="24"/>
-          <w:lang w:val="en-US" w:eastAsia="zh-CN" w:bidi="ar"/>
-        </w:rPr>
-      </w:pPr>
-      <w:r>
-        <w:rPr>
-          <w:rFonts w:hint="eastAsia" w:asciiTheme="majorEastAsia" w:hAnsiTheme="majorEastAsia" w:eastAsiaTheme="majorEastAsia" w:cstheme="majorEastAsia"/>
+          <w:b/>
+          <w:bCs/>
+          <w:kern w:val="0"/>
+          <w:sz w:val="24"/>
+          <w:szCs w:val="24"/>
+          <w:lang w:val="en-US" w:eastAsia="zh-CN" w:bidi="ar"/>
+        </w:rPr>
+      </w:pPr>
+      <w:r>
+        <w:rPr>
+          <w:rFonts w:hint="eastAsia" w:asciiTheme="majorEastAsia" w:hAnsiTheme="majorEastAsia" w:eastAsiaTheme="majorEastAsia" w:cstheme="majorEastAsia"/>
+          <w:b/>
+          <w:bCs/>
           <w:kern w:val="0"/>
           <w:sz w:val="24"/>
           <w:szCs w:val="24"/>
@@ -3030,24 +3728,659 @@
         <w:suppressLineNumbers w:val="0"/>
         <w:bidi w:val="0"/>
         <w:spacing w:line="360" w:lineRule="auto"/>
+        <w:ind w:leftChars="0" w:firstLine="480" w:firstLineChars="200"/>
+        <w:jc w:val="left"/>
+        <w:rPr>
+          <w:rFonts w:hint="eastAsia" w:asciiTheme="majorEastAsia" w:hAnsiTheme="majorEastAsia" w:eastAsiaTheme="majorEastAsia" w:cstheme="majorEastAsia"/>
+          <w:kern w:val="0"/>
+          <w:sz w:val="24"/>
+          <w:szCs w:val="24"/>
+          <w:lang w:val="en-US" w:eastAsia="zh-CN" w:bidi="ar"/>
+        </w:rPr>
+      </w:pPr>
+      <w:r>
+        <w:rPr>
+          <w:rFonts w:hint="eastAsia" w:asciiTheme="majorEastAsia" w:hAnsiTheme="majorEastAsia" w:eastAsiaTheme="majorEastAsia" w:cstheme="majorEastAsia"/>
+          <w:kern w:val="0"/>
+          <w:sz w:val="24"/>
+          <w:szCs w:val="24"/>
+          <w:lang w:val="en-US" w:eastAsia="zh-CN" w:bidi="ar"/>
+        </w:rPr>
+        <w:t>采用 多层背景 + 不同滚动速度 实现纵深感，是经典 2D 飞行射击 / 卷轴游戏的视觉效果方案。</w:t>
+      </w:r>
+    </w:p>
+    <w:p>
+      <w:pPr>
+        <w:keepNext w:val="0"/>
+        <w:keepLines w:val="0"/>
+        <w:widowControl/>
+        <w:numPr>
+          <w:ilvl w:val="0"/>
+          <w:numId w:val="0"/>
+        </w:numPr>
+        <w:suppressLineNumbers w:val="0"/>
+        <w:bidi w:val="0"/>
+        <w:spacing w:line="360" w:lineRule="auto"/>
         <w:ind w:leftChars="0"/>
         <w:jc w:val="left"/>
         <w:rPr>
           <w:rFonts w:hint="eastAsia" w:asciiTheme="majorEastAsia" w:hAnsiTheme="majorEastAsia" w:eastAsiaTheme="majorEastAsia" w:cstheme="majorEastAsia"/>
+          <w:kern w:val="0"/>
+          <w:sz w:val="24"/>
+          <w:szCs w:val="24"/>
+          <w:lang w:val="en-US" w:eastAsia="zh-CN" w:bidi="ar"/>
+        </w:rPr>
+      </w:pPr>
+      <w:r>
+        <w:rPr>
+          <w:rFonts w:hint="eastAsia" w:asciiTheme="majorEastAsia" w:hAnsiTheme="majorEastAsia" w:eastAsiaTheme="majorEastAsia" w:cstheme="majorEastAsia"/>
+          <w:kern w:val="0"/>
+          <w:sz w:val="24"/>
+          <w:szCs w:val="24"/>
+          <w:lang w:val="en-US" w:eastAsia="zh-CN" w:bidi="ar"/>
+        </w:rPr>
+        <w:t xml:space="preserve">    A.原理</w:t>
+      </w:r>
+    </w:p>
+    <w:p>
+      <w:pPr>
+        <w:keepNext w:val="0"/>
+        <w:keepLines w:val="0"/>
+        <w:widowControl/>
+        <w:numPr>
+          <w:ilvl w:val="0"/>
+          <w:numId w:val="0"/>
+        </w:numPr>
+        <w:suppressLineNumbers w:val="0"/>
+        <w:bidi w:val="0"/>
+        <w:spacing w:line="360" w:lineRule="auto"/>
+        <w:ind w:leftChars="0"/>
+        <w:jc w:val="left"/>
+        <w:rPr>
+          <w:rFonts w:hint="eastAsia" w:asciiTheme="majorEastAsia" w:hAnsiTheme="majorEastAsia" w:eastAsiaTheme="majorEastAsia" w:cstheme="majorEastAsia"/>
+          <w:kern w:val="0"/>
+          <w:sz w:val="24"/>
+          <w:szCs w:val="24"/>
+          <w:lang w:val="en-US" w:eastAsia="zh-CN" w:bidi="ar"/>
+        </w:rPr>
+      </w:pPr>
+      <w:r>
+        <w:rPr>
+          <w:rFonts w:hint="eastAsia" w:asciiTheme="majorEastAsia" w:hAnsiTheme="majorEastAsia" w:eastAsiaTheme="majorEastAsia" w:cstheme="majorEastAsia"/>
+          <w:kern w:val="0"/>
+          <w:sz w:val="24"/>
+          <w:szCs w:val="24"/>
+          <w:lang w:val="en-US" w:eastAsia="zh-CN" w:bidi="ar"/>
+        </w:rPr>
+        <w:t xml:space="preserve">    将背景分为两层：远景层（慢速）、近景层（快速）。两层同时向下滚动，速度不同，形成飞行前进的视觉效果。</w:t>
+      </w:r>
+    </w:p>
+    <w:p>
+      <w:pPr>
+        <w:keepNext w:val="0"/>
+        <w:keepLines w:val="0"/>
+        <w:widowControl/>
+        <w:numPr>
+          <w:ilvl w:val="0"/>
+          <w:numId w:val="0"/>
+        </w:numPr>
+        <w:suppressLineNumbers w:val="0"/>
+        <w:bidi w:val="0"/>
+        <w:spacing w:line="360" w:lineRule="auto"/>
+        <w:ind w:leftChars="0"/>
+        <w:jc w:val="left"/>
+        <w:rPr>
+          <w:rFonts w:hint="eastAsia" w:asciiTheme="majorEastAsia" w:hAnsiTheme="majorEastAsia" w:eastAsiaTheme="majorEastAsia" w:cstheme="majorEastAsia"/>
+          <w:kern w:val="0"/>
+          <w:sz w:val="24"/>
+          <w:szCs w:val="24"/>
+          <w:lang w:val="en-US" w:eastAsia="zh-CN" w:bidi="ar"/>
+        </w:rPr>
+      </w:pPr>
+      <w:r>
+        <w:rPr>
+          <w:rFonts w:hint="eastAsia" w:asciiTheme="majorEastAsia" w:hAnsiTheme="majorEastAsia" w:eastAsiaTheme="majorEastAsia" w:cstheme="majorEastAsia"/>
+          <w:kern w:val="0"/>
+          <w:sz w:val="24"/>
+          <w:szCs w:val="24"/>
+          <w:lang w:val="en-US" w:eastAsia="zh-CN" w:bidi="ar"/>
+        </w:rPr>
+        <w:t xml:space="preserve">    B.实现方法</w:t>
+      </w:r>
+    </w:p>
+    <w:p>
+      <w:pPr>
+        <w:keepNext w:val="0"/>
+        <w:keepLines w:val="0"/>
+        <w:widowControl/>
+        <w:numPr>
+          <w:ilvl w:val="0"/>
+          <w:numId w:val="0"/>
+        </w:numPr>
+        <w:suppressLineNumbers w:val="0"/>
+        <w:bidi w:val="0"/>
+        <w:spacing w:line="360" w:lineRule="auto"/>
+        <w:ind w:leftChars="0"/>
+        <w:jc w:val="left"/>
+        <w:rPr>
+          <w:rFonts w:hint="default" w:asciiTheme="majorEastAsia" w:hAnsiTheme="majorEastAsia" w:eastAsiaTheme="majorEastAsia" w:cstheme="majorEastAsia"/>
+          <w:kern w:val="0"/>
+          <w:sz w:val="24"/>
+          <w:szCs w:val="24"/>
+          <w:lang w:val="en-US" w:eastAsia="zh-CN" w:bidi="ar"/>
+        </w:rPr>
+      </w:pPr>
+      <w:r>
+        <w:rPr>
+          <w:rFonts w:hint="eastAsia" w:asciiTheme="majorEastAsia" w:hAnsiTheme="majorEastAsia" w:eastAsiaTheme="majorEastAsia" w:cstheme="majorEastAsia"/>
+          <w:kern w:val="0"/>
+          <w:sz w:val="24"/>
+          <w:szCs w:val="24"/>
+          <w:lang w:val="en-US" w:eastAsia="zh-CN" w:bidi="ar"/>
+        </w:rPr>
+        <w:t xml:space="preserve">    ·两层背景图片大小与屏幕一致</w:t>
+      </w:r>
+    </w:p>
+    <w:p>
+      <w:pPr>
+        <w:keepNext w:val="0"/>
+        <w:keepLines w:val="0"/>
+        <w:widowControl/>
+        <w:numPr>
+          <w:ilvl w:val="0"/>
+          <w:numId w:val="0"/>
+        </w:numPr>
+        <w:suppressLineNumbers w:val="0"/>
+        <w:bidi w:val="0"/>
+        <w:spacing w:line="360" w:lineRule="auto"/>
+        <w:ind w:leftChars="0"/>
+        <w:jc w:val="left"/>
+        <w:rPr>
+          <w:rFonts w:hint="default" w:asciiTheme="majorEastAsia" w:hAnsiTheme="majorEastAsia" w:eastAsiaTheme="majorEastAsia" w:cstheme="majorEastAsia"/>
+          <w:kern w:val="0"/>
+          <w:sz w:val="24"/>
+          <w:szCs w:val="24"/>
+          <w:lang w:val="en-US" w:eastAsia="zh-CN" w:bidi="ar"/>
+        </w:rPr>
+      </w:pPr>
+      <w:r>
+        <w:rPr>
+          <w:rFonts w:hint="eastAsia" w:asciiTheme="majorEastAsia" w:hAnsiTheme="majorEastAsia" w:eastAsiaTheme="majorEastAsia" w:cstheme="majorEastAsia"/>
+          <w:kern w:val="0"/>
+          <w:sz w:val="24"/>
+          <w:szCs w:val="24"/>
+          <w:lang w:val="en-US" w:eastAsia="zh-CN" w:bidi="ar"/>
+        </w:rPr>
+        <w:t xml:space="preserve">    ·近景层速度 = 基础速度</w:t>
+      </w:r>
+    </w:p>
+    <w:p>
+      <w:pPr>
+        <w:keepNext w:val="0"/>
+        <w:keepLines w:val="0"/>
+        <w:widowControl/>
+        <w:numPr>
+          <w:ilvl w:val="0"/>
+          <w:numId w:val="0"/>
+        </w:numPr>
+        <w:suppressLineNumbers w:val="0"/>
+        <w:bidi w:val="0"/>
+        <w:spacing w:line="360" w:lineRule="auto"/>
+        <w:ind w:leftChars="0"/>
+        <w:jc w:val="left"/>
+        <w:rPr>
+          <w:rFonts w:hint="default" w:asciiTheme="majorEastAsia" w:hAnsiTheme="majorEastAsia" w:eastAsiaTheme="majorEastAsia" w:cstheme="majorEastAsia"/>
+          <w:kern w:val="0"/>
+          <w:sz w:val="24"/>
+          <w:szCs w:val="24"/>
+          <w:lang w:val="en-US" w:eastAsia="zh-CN" w:bidi="ar"/>
+        </w:rPr>
+      </w:pPr>
+      <w:r>
+        <w:rPr>
+          <w:rFonts w:hint="eastAsia" w:asciiTheme="majorEastAsia" w:hAnsiTheme="majorEastAsia" w:eastAsiaTheme="majorEastAsia" w:cstheme="majorEastAsia"/>
+          <w:kern w:val="0"/>
+          <w:sz w:val="24"/>
+          <w:szCs w:val="24"/>
+          <w:lang w:val="en-US" w:eastAsia="zh-CN" w:bidi="ar"/>
+        </w:rPr>
+        <w:t xml:space="preserve">    ·远景层速度 = 基础速度 × 0.5（更慢，显得更远）</w:t>
+      </w:r>
+    </w:p>
+    <w:p>
+      <w:pPr>
+        <w:keepNext w:val="0"/>
+        <w:keepLines w:val="0"/>
+        <w:widowControl/>
+        <w:numPr>
+          <w:ilvl w:val="0"/>
+          <w:numId w:val="0"/>
+        </w:numPr>
+        <w:suppressLineNumbers w:val="0"/>
+        <w:bidi w:val="0"/>
+        <w:spacing w:line="360" w:lineRule="auto"/>
+        <w:ind w:leftChars="0"/>
+        <w:jc w:val="left"/>
+        <w:rPr>
+          <w:rFonts w:hint="default" w:asciiTheme="majorEastAsia" w:hAnsiTheme="majorEastAsia" w:eastAsiaTheme="majorEastAsia" w:cstheme="majorEastAsia"/>
+          <w:kern w:val="0"/>
+          <w:sz w:val="24"/>
+          <w:szCs w:val="24"/>
+          <w:lang w:val="en-US" w:eastAsia="zh-CN" w:bidi="ar"/>
+        </w:rPr>
+      </w:pPr>
+      <w:r>
+        <w:rPr>
+          <w:rFonts w:hint="eastAsia" w:asciiTheme="majorEastAsia" w:hAnsiTheme="majorEastAsia" w:eastAsiaTheme="majorEastAsia" w:cstheme="majorEastAsia"/>
+          <w:kern w:val="0"/>
+          <w:sz w:val="24"/>
+          <w:szCs w:val="24"/>
+          <w:lang w:val="en-US" w:eastAsia="zh-CN" w:bidi="ar"/>
+        </w:rPr>
+        <w:t xml:space="preserve">    ·当背景滚动超过图片高度时，重置 Y 坐标，实现无缝循环</w:t>
+      </w:r>
+    </w:p>
+    <w:p>
+      <w:pPr>
+        <w:keepNext w:val="0"/>
+        <w:keepLines w:val="0"/>
+        <w:widowControl/>
+        <w:numPr>
+          <w:ilvl w:val="0"/>
+          <w:numId w:val="0"/>
+        </w:numPr>
+        <w:suppressLineNumbers w:val="0"/>
+        <w:bidi w:val="0"/>
+        <w:spacing w:line="360" w:lineRule="auto"/>
+        <w:ind w:leftChars="0"/>
+        <w:jc w:val="left"/>
+        <w:rPr>
+          <w:rFonts w:hint="eastAsia" w:asciiTheme="majorEastAsia" w:hAnsiTheme="majorEastAsia" w:eastAsiaTheme="majorEastAsia" w:cstheme="majorEastAsia"/>
+          <w:kern w:val="0"/>
+          <w:sz w:val="24"/>
+          <w:szCs w:val="24"/>
+          <w:lang w:val="en-US" w:eastAsia="zh-CN" w:bidi="ar"/>
+        </w:rPr>
+      </w:pPr>
+      <w:r>
+        <w:rPr>
+          <w:rFonts w:hint="eastAsia" w:asciiTheme="majorEastAsia" w:hAnsiTheme="majorEastAsia" w:eastAsiaTheme="majorEastAsia" w:cstheme="majorEastAsia"/>
+          <w:kern w:val="0"/>
+          <w:sz w:val="24"/>
+          <w:szCs w:val="24"/>
+          <w:lang w:val="en-US" w:eastAsia="zh-CN" w:bidi="ar"/>
+        </w:rPr>
+        <w:t xml:space="preserve">    C.视觉效果</w:t>
+      </w:r>
+    </w:p>
+    <w:p>
+      <w:pPr>
+        <w:keepNext w:val="0"/>
+        <w:keepLines w:val="0"/>
+        <w:widowControl/>
+        <w:numPr>
+          <w:ilvl w:val="0"/>
+          <w:numId w:val="0"/>
+        </w:numPr>
+        <w:suppressLineNumbers w:val="0"/>
+        <w:bidi w:val="0"/>
+        <w:spacing w:line="360" w:lineRule="auto"/>
+        <w:ind w:leftChars="0"/>
+        <w:jc w:val="left"/>
+        <w:rPr>
+          <w:rFonts w:hint="default" w:asciiTheme="majorEastAsia" w:hAnsiTheme="majorEastAsia" w:eastAsiaTheme="majorEastAsia" w:cstheme="majorEastAsia"/>
+          <w:kern w:val="0"/>
+          <w:sz w:val="24"/>
+          <w:szCs w:val="24"/>
+          <w:lang w:val="en-US" w:eastAsia="zh-CN" w:bidi="ar"/>
+        </w:rPr>
+      </w:pPr>
+      <w:r>
+        <w:rPr>
+          <w:rFonts w:hint="eastAsia" w:asciiTheme="majorEastAsia" w:hAnsiTheme="majorEastAsia" w:eastAsiaTheme="majorEastAsia" w:cstheme="majorEastAsia"/>
+          <w:kern w:val="0"/>
+          <w:sz w:val="24"/>
+          <w:szCs w:val="24"/>
+          <w:lang w:val="en-US" w:eastAsia="zh-CN" w:bidi="ar"/>
+        </w:rPr>
+        <w:t xml:space="preserve">    ·滚动流畅无断层</w:t>
+      </w:r>
+    </w:p>
+    <w:p>
+      <w:pPr>
+        <w:keepNext w:val="0"/>
+        <w:keepLines w:val="0"/>
+        <w:widowControl/>
+        <w:numPr>
+          <w:ilvl w:val="0"/>
+          <w:numId w:val="0"/>
+        </w:numPr>
+        <w:suppressLineNumbers w:val="0"/>
+        <w:bidi w:val="0"/>
+        <w:spacing w:line="360" w:lineRule="auto"/>
+        <w:ind w:leftChars="0"/>
+        <w:jc w:val="left"/>
+        <w:rPr>
+          <w:rFonts w:hint="default" w:asciiTheme="majorEastAsia" w:hAnsiTheme="majorEastAsia" w:eastAsiaTheme="majorEastAsia" w:cstheme="majorEastAsia"/>
+          <w:kern w:val="0"/>
+          <w:sz w:val="24"/>
+          <w:szCs w:val="24"/>
+          <w:lang w:val="en-US" w:eastAsia="zh-CN" w:bidi="ar"/>
+        </w:rPr>
+      </w:pPr>
+      <w:r>
+        <w:rPr>
+          <w:rFonts w:hint="eastAsia" w:asciiTheme="majorEastAsia" w:hAnsiTheme="majorEastAsia" w:eastAsiaTheme="majorEastAsia" w:cstheme="majorEastAsia"/>
+          <w:kern w:val="0"/>
+          <w:sz w:val="24"/>
+          <w:szCs w:val="24"/>
+          <w:lang w:val="en-US" w:eastAsia="zh-CN" w:bidi="ar"/>
+        </w:rPr>
+        <w:t xml:space="preserve">    ·空间感强，提升游戏沉浸感</w:t>
+      </w:r>
+    </w:p>
+    <w:p>
+      <w:pPr>
+        <w:keepNext w:val="0"/>
+        <w:keepLines w:val="0"/>
+        <w:widowControl/>
+        <w:numPr>
+          <w:ilvl w:val="0"/>
+          <w:numId w:val="0"/>
+        </w:numPr>
+        <w:suppressLineNumbers w:val="0"/>
+        <w:bidi w:val="0"/>
+        <w:spacing w:line="360" w:lineRule="auto"/>
+        <w:ind w:leftChars="0"/>
+        <w:jc w:val="left"/>
+        <w:rPr>
+          <w:rFonts w:hint="eastAsia" w:asciiTheme="majorEastAsia" w:hAnsiTheme="majorEastAsia" w:eastAsiaTheme="majorEastAsia" w:cstheme="majorEastAsia"/>
+          <w:kern w:val="0"/>
+          <w:sz w:val="24"/>
+          <w:szCs w:val="24"/>
+          <w:lang w:val="en-US" w:eastAsia="zh-CN" w:bidi="ar"/>
+        </w:rPr>
+      </w:pPr>
+      <w:r>
+        <w:rPr>
+          <w:rFonts w:hint="eastAsia" w:asciiTheme="majorEastAsia" w:hAnsiTheme="majorEastAsia" w:eastAsiaTheme="majorEastAsia" w:cstheme="majorEastAsia"/>
+          <w:kern w:val="0"/>
+          <w:sz w:val="24"/>
+          <w:szCs w:val="24"/>
+          <w:lang w:val="en-US" w:eastAsia="zh-CN" w:bidi="ar"/>
+        </w:rPr>
+        <w:t xml:space="preserve">    D.核心代码逻辑</w:t>
+      </w:r>
+    </w:p>
+    <w:p>
+      <w:pPr>
+        <w:keepNext w:val="0"/>
+        <w:keepLines w:val="0"/>
+        <w:widowControl/>
+        <w:numPr>
+          <w:ilvl w:val="0"/>
+          <w:numId w:val="0"/>
+        </w:numPr>
+        <w:suppressLineNumbers w:val="0"/>
+        <w:bidi w:val="0"/>
+        <w:spacing w:line="360" w:lineRule="auto"/>
+        <w:ind w:leftChars="0" w:firstLine="360" w:firstLineChars="200"/>
+        <w:jc w:val="left"/>
+        <w:rPr>
+          <w:rFonts w:hint="default" w:asciiTheme="minorAscii" w:hAnsiTheme="minorAscii" w:eastAsiaTheme="majorEastAsia" w:cstheme="majorEastAsia"/>
+          <w:sz w:val="18"/>
+          <w:szCs w:val="18"/>
+        </w:rPr>
+      </w:pPr>
+      <w:r>
+        <w:rPr>
+          <w:rFonts w:hint="default" w:asciiTheme="minorAscii" w:hAnsiTheme="minorAscii" w:eastAsiaTheme="majorEastAsia" w:cstheme="majorEastAsia"/>
+          <w:sz w:val="18"/>
+          <w:szCs w:val="18"/>
+        </w:rPr>
+        <w:t>// 近景快速滚动</w:t>
+      </w:r>
+    </w:p>
+    <w:p>
+      <w:pPr>
+        <w:keepNext w:val="0"/>
+        <w:keepLines w:val="0"/>
+        <w:widowControl/>
+        <w:numPr>
+          <w:ilvl w:val="0"/>
+          <w:numId w:val="0"/>
+        </w:numPr>
+        <w:suppressLineNumbers w:val="0"/>
+        <w:bidi w:val="0"/>
+        <w:spacing w:line="360" w:lineRule="auto"/>
+        <w:ind w:leftChars="0" w:firstLine="360" w:firstLineChars="200"/>
+        <w:jc w:val="left"/>
+        <w:rPr>
+          <w:rFonts w:hint="default" w:asciiTheme="minorAscii" w:hAnsiTheme="minorAscii" w:eastAsiaTheme="majorEastAsia" w:cstheme="majorEastAsia"/>
+          <w:sz w:val="18"/>
+          <w:szCs w:val="18"/>
+        </w:rPr>
+      </w:pPr>
+      <w:r>
+        <w:rPr>
+          <w:rFonts w:hint="default" w:asciiTheme="minorAscii" w:hAnsiTheme="minorAscii" w:eastAsiaTheme="majorEastAsia" w:cstheme="majorEastAsia"/>
+          <w:sz w:val="18"/>
+          <w:szCs w:val="18"/>
+        </w:rPr>
+        <w:t>bgLayer1Y += scrollSpeed * dt.asSeconds();</w:t>
+      </w:r>
+    </w:p>
+    <w:p>
+      <w:pPr>
+        <w:keepNext w:val="0"/>
+        <w:keepLines w:val="0"/>
+        <w:widowControl/>
+        <w:numPr>
+          <w:ilvl w:val="0"/>
+          <w:numId w:val="0"/>
+        </w:numPr>
+        <w:suppressLineNumbers w:val="0"/>
+        <w:bidi w:val="0"/>
+        <w:spacing w:line="360" w:lineRule="auto"/>
+        <w:ind w:leftChars="0" w:firstLine="360" w:firstLineChars="200"/>
+        <w:jc w:val="left"/>
+        <w:rPr>
+          <w:rFonts w:hint="default" w:asciiTheme="minorAscii" w:hAnsiTheme="minorAscii" w:eastAsiaTheme="majorEastAsia" w:cstheme="majorEastAsia"/>
+          <w:sz w:val="18"/>
+          <w:szCs w:val="18"/>
+        </w:rPr>
+      </w:pPr>
+      <w:r>
+        <w:rPr>
+          <w:rFonts w:hint="default" w:asciiTheme="minorAscii" w:hAnsiTheme="minorAscii" w:eastAsiaTheme="majorEastAsia" w:cstheme="majorEastAsia"/>
+          <w:sz w:val="18"/>
+          <w:szCs w:val="18"/>
+        </w:rPr>
+        <w:t>// 远景慢速滚动</w:t>
+      </w:r>
+    </w:p>
+    <w:p>
+      <w:pPr>
+        <w:keepNext w:val="0"/>
+        <w:keepLines w:val="0"/>
+        <w:widowControl/>
+        <w:numPr>
+          <w:ilvl w:val="0"/>
+          <w:numId w:val="0"/>
+        </w:numPr>
+        <w:suppressLineNumbers w:val="0"/>
+        <w:bidi w:val="0"/>
+        <w:spacing w:line="360" w:lineRule="auto"/>
+        <w:ind w:leftChars="0" w:firstLine="360" w:firstLineChars="200"/>
+        <w:jc w:val="left"/>
+        <w:rPr>
+          <w:rFonts w:hint="default" w:asciiTheme="minorAscii" w:hAnsiTheme="minorAscii" w:eastAsiaTheme="majorEastAsia" w:cstheme="majorEastAsia"/>
+          <w:sz w:val="18"/>
+          <w:szCs w:val="18"/>
+        </w:rPr>
+      </w:pPr>
+      <w:r>
+        <w:rPr>
+          <w:rFonts w:hint="default" w:asciiTheme="minorAscii" w:hAnsiTheme="minorAscii" w:eastAsiaTheme="majorEastAsia" w:cstheme="majorEastAsia"/>
+          <w:sz w:val="18"/>
+          <w:szCs w:val="18"/>
+        </w:rPr>
+        <w:t>bgLayer2Y += scrollSpeed * 0.5f * dt.asSeconds();</w:t>
+      </w:r>
+    </w:p>
+    <w:p>
+      <w:pPr>
+        <w:keepNext w:val="0"/>
+        <w:keepLines w:val="0"/>
+        <w:widowControl/>
+        <w:numPr>
+          <w:ilvl w:val="0"/>
+          <w:numId w:val="0"/>
+        </w:numPr>
+        <w:suppressLineNumbers w:val="0"/>
+        <w:bidi w:val="0"/>
+        <w:spacing w:line="360" w:lineRule="auto"/>
+        <w:ind w:leftChars="0" w:firstLine="360" w:firstLineChars="200"/>
+        <w:jc w:val="left"/>
+        <w:rPr>
+          <w:rFonts w:hint="default" w:asciiTheme="minorAscii" w:hAnsiTheme="minorAscii" w:eastAsiaTheme="majorEastAsia" w:cstheme="majorEastAsia"/>
+          <w:sz w:val="18"/>
+          <w:szCs w:val="18"/>
+        </w:rPr>
+      </w:pPr>
+      <w:r>
+        <w:rPr>
+          <w:rFonts w:hint="default" w:asciiTheme="minorAscii" w:hAnsiTheme="minorAscii" w:eastAsiaTheme="majorEastAsia" w:cstheme="majorEastAsia"/>
+          <w:sz w:val="18"/>
+          <w:szCs w:val="18"/>
+        </w:rPr>
+        <w:t>// 超出高度后重置，实现无缝滚动</w:t>
+      </w:r>
+    </w:p>
+    <w:p>
+      <w:pPr>
+        <w:keepNext w:val="0"/>
+        <w:keepLines w:val="0"/>
+        <w:widowControl/>
+        <w:numPr>
+          <w:ilvl w:val="0"/>
+          <w:numId w:val="0"/>
+        </w:numPr>
+        <w:suppressLineNumbers w:val="0"/>
+        <w:bidi w:val="0"/>
+        <w:spacing w:line="360" w:lineRule="auto"/>
+        <w:ind w:leftChars="0" w:firstLine="360" w:firstLineChars="200"/>
+        <w:jc w:val="left"/>
+        <w:rPr>
+          <w:rFonts w:hint="default" w:asciiTheme="minorAscii" w:hAnsiTheme="minorAscii" w:eastAsiaTheme="majorEastAsia" w:cstheme="majorEastAsia"/>
+          <w:sz w:val="18"/>
+          <w:szCs w:val="18"/>
+        </w:rPr>
+      </w:pPr>
+      <w:r>
+        <w:rPr>
+          <w:rFonts w:hint="default" w:asciiTheme="minorAscii" w:hAnsiTheme="minorAscii" w:eastAsiaTheme="majorEastAsia" w:cstheme="majorEastAsia"/>
+          <w:sz w:val="18"/>
+          <w:szCs w:val="18"/>
+        </w:rPr>
+        <w:t>if (bgLayer1Y &gt; textureHeight) {</w:t>
+      </w:r>
+    </w:p>
+    <w:p>
+      <w:pPr>
+        <w:keepNext w:val="0"/>
+        <w:keepLines w:val="0"/>
+        <w:widowControl/>
+        <w:numPr>
+          <w:ilvl w:val="0"/>
+          <w:numId w:val="0"/>
+        </w:numPr>
+        <w:suppressLineNumbers w:val="0"/>
+        <w:bidi w:val="0"/>
+        <w:spacing w:line="360" w:lineRule="auto"/>
+        <w:ind w:leftChars="0"/>
+        <w:jc w:val="left"/>
+        <w:rPr>
+          <w:rFonts w:hint="default" w:asciiTheme="minorAscii" w:hAnsiTheme="minorAscii" w:eastAsiaTheme="majorEastAsia" w:cstheme="majorEastAsia"/>
+          <w:sz w:val="18"/>
+          <w:szCs w:val="18"/>
+        </w:rPr>
+      </w:pPr>
+      <w:r>
+        <w:rPr>
+          <w:rFonts w:hint="default" w:asciiTheme="minorAscii" w:hAnsiTheme="minorAscii" w:eastAsiaTheme="majorEastAsia" w:cstheme="majorEastAsia"/>
+          <w:sz w:val="18"/>
+          <w:szCs w:val="18"/>
+        </w:rPr>
+        <w:t xml:space="preserve">    </w:t>
+      </w:r>
+      <w:r>
+        <w:rPr>
+          <w:rFonts w:hint="eastAsia" w:asciiTheme="minorAscii" w:hAnsiTheme="minorAscii" w:eastAsiaTheme="majorEastAsia" w:cstheme="majorEastAsia"/>
+          <w:sz w:val="18"/>
+          <w:szCs w:val="18"/>
+          <w:lang w:val="en-US" w:eastAsia="zh-CN"/>
+        </w:rPr>
+        <w:t xml:space="preserve">  </w:t>
+      </w:r>
+      <w:r>
+        <w:rPr>
+          <w:rFonts w:hint="default" w:asciiTheme="minorAscii" w:hAnsiTheme="minorAscii" w:eastAsiaTheme="majorEastAsia" w:cstheme="majorEastAsia"/>
+          <w:sz w:val="18"/>
+          <w:szCs w:val="18"/>
+        </w:rPr>
+        <w:t>bgLayer1Y = 0;</w:t>
+      </w:r>
+    </w:p>
+    <w:p>
+      <w:pPr>
+        <w:keepNext w:val="0"/>
+        <w:keepLines w:val="0"/>
+        <w:widowControl/>
+        <w:numPr>
+          <w:ilvl w:val="0"/>
+          <w:numId w:val="0"/>
+        </w:numPr>
+        <w:suppressLineNumbers w:val="0"/>
+        <w:bidi w:val="0"/>
+        <w:spacing w:line="360" w:lineRule="auto"/>
+        <w:ind w:leftChars="0" w:firstLine="360" w:firstLineChars="200"/>
+        <w:jc w:val="left"/>
+        <w:rPr>
+          <w:rFonts w:hint="default" w:asciiTheme="minorAscii" w:hAnsiTheme="minorAscii" w:eastAsiaTheme="majorEastAsia" w:cstheme="majorEastAsia"/>
+          <w:sz w:val="18"/>
+          <w:szCs w:val="18"/>
+        </w:rPr>
+      </w:pPr>
+      <w:r>
+        <w:rPr>
+          <w:rFonts w:hint="default" w:asciiTheme="minorAscii" w:hAnsiTheme="minorAscii" w:eastAsiaTheme="majorEastAsia" w:cstheme="majorEastAsia"/>
+          <w:sz w:val="18"/>
+          <w:szCs w:val="18"/>
+        </w:rPr>
+        <w:t>}</w:t>
+      </w:r>
+    </w:p>
+    <w:p>
+      <w:pPr>
+        <w:keepNext w:val="0"/>
+        <w:keepLines w:val="0"/>
+        <w:widowControl/>
+        <w:numPr>
+          <w:ilvl w:val="0"/>
+          <w:numId w:val="0"/>
+        </w:numPr>
+        <w:suppressLineNumbers w:val="0"/>
+        <w:bidi w:val="0"/>
+        <w:spacing w:line="360" w:lineRule="auto"/>
+        <w:ind w:leftChars="0"/>
+        <w:jc w:val="left"/>
+        <w:rPr>
+          <w:rFonts w:hint="eastAsia" w:asciiTheme="majorEastAsia" w:hAnsiTheme="majorEastAsia" w:eastAsiaTheme="majorEastAsia" w:cstheme="majorEastAsia"/>
           <w:sz w:val="21"/>
           <w:szCs w:val="24"/>
         </w:rPr>
       </w:pPr>
-      <w:r>
-        <w:rPr>
-          <w:rFonts w:hint="eastAsia" w:asciiTheme="majorEastAsia" w:hAnsiTheme="majorEastAsia" w:eastAsiaTheme="majorEastAsia" w:cstheme="majorEastAsia"/>
-          <w:kern w:val="0"/>
-          <w:sz w:val="24"/>
-          <w:szCs w:val="24"/>
-          <w:lang w:val="en-US" w:eastAsia="zh-CN" w:bidi="ar"/>
-        </w:rPr>
-        <w:t>多层背景以不同速度向下滚动，模拟飞行纵深效果，背景滚动至底部后重置位置，实现循环滚动。</w:t>
-      </w:r>
     </w:p>
     <w:p>
       <w:pPr>
@@ -3103,7 +4436,7 @@
         <w:widowControl/>
         <w:numPr>
           <w:ilvl w:val="0"/>
-          <w:numId w:val="4"/>
+          <w:numId w:val="6"/>
         </w:numPr>
         <w:suppressLineNumbers w:val="0"/>
         <w:spacing w:line="360" w:lineRule="auto"/>
@@ -3129,7 +4462,7 @@
         <w:widowControl/>
         <w:numPr>
           <w:ilvl w:val="0"/>
-          <w:numId w:val="4"/>
+          <w:numId w:val="6"/>
         </w:numPr>
         <w:suppressLineNumbers w:val="0"/>
         <w:spacing w:line="360" w:lineRule="auto"/>
@@ -3155,7 +4488,7 @@
         <w:widowControl/>
         <w:numPr>
           <w:ilvl w:val="0"/>
-          <w:numId w:val="4"/>
+          <w:numId w:val="6"/>
         </w:numPr>
         <w:suppressLineNumbers w:val="0"/>
         <w:spacing w:line="360" w:lineRule="auto"/>
@@ -3181,7 +4514,7 @@
         <w:widowControl/>
         <w:numPr>
           <w:ilvl w:val="0"/>
-          <w:numId w:val="4"/>
+          <w:numId w:val="6"/>
         </w:numPr>
         <w:suppressLineNumbers w:val="0"/>
         <w:spacing w:line="360" w:lineRule="auto"/>
@@ -3207,7 +4540,7 @@
         <w:widowControl/>
         <w:numPr>
           <w:ilvl w:val="0"/>
-          <w:numId w:val="4"/>
+          <w:numId w:val="6"/>
         </w:numPr>
         <w:suppressLineNumbers w:val="0"/>
         <w:spacing w:line="360" w:lineRule="auto"/>
@@ -3459,7 +4792,7 @@
         </w:tc>
         <w:tc>
           <w:tcPr>
-            <w:tcW w:w="0" w:type="auto"/>
+            <w:tcW w:w="2910" w:type="dxa"/>
             <w:shd w:val="clear" w:color="auto" w:fill="auto"/>
             <w:vAlign w:val="center"/>
           </w:tcPr>
@@ -3578,7 +4911,7 @@
         </w:tc>
         <w:tc>
           <w:tcPr>
-            <w:tcW w:w="0" w:type="auto"/>
+            <w:tcW w:w="2910" w:type="dxa"/>
             <w:shd w:val="clear" w:color="auto" w:fill="auto"/>
             <w:vAlign w:val="center"/>
           </w:tcPr>
@@ -3693,7 +5026,7 @@
         </w:tc>
         <w:tc>
           <w:tcPr>
-            <w:tcW w:w="0" w:type="auto"/>
+            <w:tcW w:w="2910" w:type="dxa"/>
             <w:shd w:val="clear" w:color="auto" w:fill="auto"/>
             <w:vAlign w:val="center"/>
           </w:tcPr>
@@ -3733,6 +5066,7 @@
             <w:insideH w:val="none" w:color="auto" w:sz="0" w:space="0"/>
             <w:insideV w:val="none" w:color="auto" w:sz="0" w:space="0"/>
           </w:tblBorders>
+          <w:shd w:val="clear" w:color="auto" w:fill="auto"/>
           <w:tblCellMar>
             <w:top w:w="15" w:type="dxa"/>
             <w:left w:w="15" w:type="dxa"/>
@@ -3807,7 +5141,7 @@
         </w:tc>
         <w:tc>
           <w:tcPr>
-            <w:tcW w:w="0" w:type="auto"/>
+            <w:tcW w:w="2910" w:type="dxa"/>
             <w:shd w:val="clear" w:color="auto" w:fill="auto"/>
             <w:vAlign w:val="center"/>
           </w:tcPr>
@@ -3922,7 +5256,7 @@
         </w:tc>
         <w:tc>
           <w:tcPr>
-            <w:tcW w:w="0" w:type="auto"/>
+            <w:tcW w:w="2910" w:type="dxa"/>
             <w:shd w:val="clear" w:color="auto" w:fill="auto"/>
             <w:vAlign w:val="center"/>
           </w:tcPr>
@@ -4037,7 +5371,7 @@
         </w:tc>
         <w:tc>
           <w:tcPr>
-            <w:tcW w:w="0" w:type="auto"/>
+            <w:tcW w:w="2910" w:type="dxa"/>
             <w:shd w:val="clear" w:color="auto" w:fill="auto"/>
             <w:vAlign w:val="center"/>
           </w:tcPr>
@@ -4077,6 +5411,7 @@
             <w:insideH w:val="none" w:color="auto" w:sz="0" w:space="0"/>
             <w:insideV w:val="none" w:color="auto" w:sz="0" w:space="0"/>
           </w:tblBorders>
+          <w:shd w:val="clear" w:color="auto" w:fill="auto"/>
           <w:tblCellMar>
             <w:top w:w="15" w:type="dxa"/>
             <w:left w:w="15" w:type="dxa"/>
@@ -4151,7 +5486,7 @@
         </w:tc>
         <w:tc>
           <w:tcPr>
-            <w:tcW w:w="0" w:type="auto"/>
+            <w:tcW w:w="2910" w:type="dxa"/>
             <w:shd w:val="clear" w:color="auto" w:fill="auto"/>
             <w:vAlign w:val="center"/>
           </w:tcPr>
@@ -4266,7 +5601,7 @@
         </w:tc>
         <w:tc>
           <w:tcPr>
-            <w:tcW w:w="0" w:type="auto"/>
+            <w:tcW w:w="2910" w:type="dxa"/>
             <w:shd w:val="clear" w:color="auto" w:fill="auto"/>
             <w:vAlign w:val="center"/>
           </w:tcPr>
@@ -4327,7 +5662,7 @@
         <w:widowControl/>
         <w:numPr>
           <w:ilvl w:val="0"/>
-          <w:numId w:val="5"/>
+          <w:numId w:val="7"/>
         </w:numPr>
         <w:suppressLineNumbers w:val="0"/>
         <w:spacing w:before="0" w:beforeAutospacing="1" w:after="0" w:afterAutospacing="1" w:line="360" w:lineRule="auto"/>
@@ -4350,7 +5685,7 @@
         <w:widowControl/>
         <w:numPr>
           <w:ilvl w:val="0"/>
-          <w:numId w:val="5"/>
+          <w:numId w:val="7"/>
         </w:numPr>
         <w:suppressLineNumbers w:val="0"/>
         <w:spacing w:before="0" w:beforeAutospacing="1" w:after="0" w:afterAutospacing="1" w:line="360" w:lineRule="auto"/>
@@ -4373,7 +5708,7 @@
         <w:widowControl/>
         <w:numPr>
           <w:ilvl w:val="0"/>
-          <w:numId w:val="5"/>
+          <w:numId w:val="7"/>
         </w:numPr>
         <w:suppressLineNumbers w:val="0"/>
         <w:spacing w:before="0" w:beforeAutospacing="1" w:after="0" w:afterAutospacing="1" w:line="360" w:lineRule="auto"/>
@@ -4396,7 +5731,7 @@
         <w:widowControl/>
         <w:numPr>
           <w:ilvl w:val="0"/>
-          <w:numId w:val="5"/>
+          <w:numId w:val="7"/>
         </w:numPr>
         <w:suppressLineNumbers w:val="0"/>
         <w:spacing w:before="0" w:beforeAutospacing="1" w:after="0" w:afterAutospacing="1" w:line="360" w:lineRule="auto"/>
@@ -4468,18 +5803,19 @@
         <w:spacing w:line="360" w:lineRule="auto"/>
         <w:jc w:val="left"/>
         <w:rPr>
-          <w:rFonts w:hint="eastAsia" w:asciiTheme="majorEastAsia" w:hAnsiTheme="majorEastAsia" w:eastAsiaTheme="majorEastAsia" w:cstheme="majorEastAsia"/>
-        </w:rPr>
-      </w:pPr>
-      <w:r>
-        <w:rPr>
-          <w:rFonts w:hint="eastAsia" w:asciiTheme="majorEastAsia" w:hAnsiTheme="majorEastAsia" w:eastAsiaTheme="majorEastAsia" w:cstheme="majorEastAsia"/>
-          <w:kern w:val="0"/>
-          <w:sz w:val="24"/>
-          <w:szCs w:val="24"/>
-          <w:lang w:val="en-US" w:eastAsia="zh-CN" w:bidi="ar"/>
-        </w:rPr>
-        <w:t>GPT-4</w:t>
+          <w:rFonts w:hint="default" w:asciiTheme="majorEastAsia" w:hAnsiTheme="majorEastAsia" w:eastAsiaTheme="majorEastAsia" w:cstheme="majorEastAsia"/>
+          <w:lang w:val="en-US"/>
+        </w:rPr>
+      </w:pPr>
+      <w:r>
+        <w:rPr>
+          <w:rFonts w:hint="eastAsia" w:asciiTheme="majorEastAsia" w:hAnsiTheme="majorEastAsia" w:eastAsiaTheme="majorEastAsia" w:cstheme="majorEastAsia"/>
+          <w:kern w:val="0"/>
+          <w:sz w:val="24"/>
+          <w:szCs w:val="24"/>
+          <w:lang w:val="en-US" w:eastAsia="zh-CN" w:bidi="ar"/>
+        </w:rPr>
+        <w:t>GPT-5.4</w:t>
       </w:r>
     </w:p>
     <w:p>
@@ -4533,7 +5869,7 @@
           <w:sz w:val="24"/>
           <w:szCs w:val="24"/>
         </w:rPr>
-        <w:t>代码开发：游戏模块化架构设计、SFML 库使用方法、碰撞检测逻辑实现；</w:t>
+        <w:t>技术学习与选型：学习 C++ 第三方库的对比与选择、学习 GitHub/Gitee 代码托管平台的使用规范、提交方法、分支管理；</w:t>
       </w:r>
     </w:p>
     <w:p>
@@ -4564,7 +5900,7 @@
           <w:sz w:val="24"/>
           <w:szCs w:val="24"/>
         </w:rPr>
-        <w:t>代码调试：解决程序崩溃、内存泄漏、输入响应异常等问题；</w:t>
+        <w:t>美术资源生成：生成游戏所需的角色、敌人、道具、背景等图片美术素材设计方案；</w:t>
       </w:r>
     </w:p>
     <w:p>
@@ -4595,142 +5931,128 @@
           <w:sz w:val="24"/>
           <w:szCs w:val="24"/>
         </w:rPr>
-        <w:t>特效实现：粒子系统、光影特效的代码逻辑优化；</w:t>
-      </w:r>
-    </w:p>
-    <w:p>
-      <w:pPr>
-        <w:keepNext w:val="0"/>
-        <w:keepLines w:val="0"/>
-        <w:widowControl/>
-        <w:suppressLineNumbers w:val="0"/>
-        <w:spacing w:line="360" w:lineRule="auto"/>
-        <w:rPr>
-          <w:rFonts w:hint="eastAsia" w:asciiTheme="majorEastAsia" w:hAnsiTheme="majorEastAsia" w:eastAsiaTheme="majorEastAsia" w:cstheme="majorEastAsia"/>
-          <w:sz w:val="24"/>
-          <w:szCs w:val="24"/>
-        </w:rPr>
-      </w:pPr>
-      <w:r>
-        <w:rPr>
-          <w:rFonts w:hint="eastAsia" w:asciiTheme="majorEastAsia" w:hAnsiTheme="majorEastAsia" w:eastAsiaTheme="majorEastAsia" w:cstheme="majorEastAsia"/>
-          <w:sz w:val="24"/>
-          <w:szCs w:val="24"/>
+        <w:t>代码调试：解决程序崩溃、内存泄漏、输入响应异常、资源加载失败等问题；</w:t>
+      </w:r>
+    </w:p>
+    <w:p>
+      <w:pPr>
+        <w:pStyle w:val="3"/>
+        <w:keepNext w:val="0"/>
+        <w:keepLines w:val="0"/>
+        <w:widowControl/>
+        <w:suppressLineNumbers w:val="0"/>
+        <w:spacing w:line="360" w:lineRule="auto"/>
+        <w:rPr>
+          <w:rFonts w:hint="eastAsia" w:asciiTheme="majorEastAsia" w:hAnsiTheme="majorEastAsia" w:eastAsiaTheme="majorEastAsia" w:cstheme="majorEastAsia"/>
+          <w:sz w:val="24"/>
+          <w:szCs w:val="24"/>
+        </w:rPr>
+      </w:pPr>
+      <w:r>
+        <w:rPr>
+          <w:rFonts w:hint="eastAsia" w:asciiTheme="majorEastAsia" w:hAnsiTheme="majorEastAsia" w:eastAsiaTheme="majorEastAsia" w:cstheme="majorEastAsia"/>
+          <w:sz w:val="24"/>
+          <w:szCs w:val="24"/>
+        </w:rPr>
+        <w:t>3. 使用位置</w:t>
+      </w:r>
+    </w:p>
+    <w:p>
+      <w:pPr>
+        <w:keepNext w:val="0"/>
+        <w:keepLines w:val="0"/>
+        <w:widowControl/>
+        <w:suppressLineNumbers w:val="0"/>
+        <w:spacing w:line="360" w:lineRule="auto"/>
+        <w:rPr>
+          <w:rFonts w:hint="eastAsia" w:asciiTheme="minorEastAsia" w:hAnsiTheme="minorEastAsia" w:eastAsiaTheme="minorEastAsia" w:cstheme="minorEastAsia"/>
+          <w:b w:val="0"/>
+          <w:bCs/>
+          <w:sz w:val="24"/>
+          <w:szCs w:val="32"/>
+        </w:rPr>
+      </w:pPr>
+      <w:r>
+        <w:rPr>
+          <w:rStyle w:val="9"/>
+          <w:rFonts w:hint="eastAsia" w:asciiTheme="minorEastAsia" w:hAnsiTheme="minorEastAsia" w:eastAsiaTheme="minorEastAsia" w:cstheme="minorEastAsia"/>
+          <w:b w:val="0"/>
+          <w:bCs/>
+          <w:sz w:val="24"/>
+          <w:szCs w:val="32"/>
           <w:lang w:val="en-US" w:eastAsia="zh-CN"/>
         </w:rPr>
-        <w:t>4.</w:t>
-      </w:r>
-      <w:r>
-        <w:rPr>
-          <w:rFonts w:hint="eastAsia" w:asciiTheme="majorEastAsia" w:hAnsiTheme="majorEastAsia" w:eastAsiaTheme="majorEastAsia" w:cstheme="majorEastAsia"/>
-          <w:sz w:val="24"/>
-          <w:szCs w:val="24"/>
-        </w:rPr>
-        <w:t>文档撰写：辅助完成实验报告的编写与格式整理。</w:t>
-      </w:r>
-    </w:p>
-    <w:p>
-      <w:pPr>
-        <w:pStyle w:val="3"/>
-        <w:keepNext w:val="0"/>
-        <w:keepLines w:val="0"/>
-        <w:widowControl/>
-        <w:suppressLineNumbers w:val="0"/>
-        <w:spacing w:line="360" w:lineRule="auto"/>
-        <w:rPr>
-          <w:rFonts w:hint="eastAsia" w:asciiTheme="majorEastAsia" w:hAnsiTheme="majorEastAsia" w:eastAsiaTheme="majorEastAsia" w:cstheme="majorEastAsia"/>
-          <w:sz w:val="24"/>
-          <w:szCs w:val="24"/>
-        </w:rPr>
-      </w:pPr>
-      <w:r>
-        <w:rPr>
-          <w:rFonts w:hint="eastAsia" w:asciiTheme="majorEastAsia" w:hAnsiTheme="majorEastAsia" w:eastAsiaTheme="majorEastAsia" w:cstheme="majorEastAsia"/>
-          <w:sz w:val="24"/>
-          <w:szCs w:val="24"/>
-        </w:rPr>
-        <w:t>3. 使用位置</w:t>
-      </w:r>
-    </w:p>
-    <w:p>
-      <w:pPr>
-        <w:keepNext w:val="0"/>
-        <w:keepLines w:val="0"/>
-        <w:widowControl/>
-        <w:numPr>
-          <w:ilvl w:val="0"/>
-          <w:numId w:val="6"/>
-        </w:numPr>
-        <w:suppressLineNumbers w:val="0"/>
-        <w:spacing w:before="0" w:beforeAutospacing="1" w:after="0" w:afterAutospacing="1" w:line="360" w:lineRule="auto"/>
-        <w:ind w:left="360" w:leftChars="0" w:hanging="360" w:firstLineChars="0"/>
-        <w:rPr>
-          <w:rFonts w:hint="eastAsia" w:asciiTheme="majorEastAsia" w:hAnsiTheme="majorEastAsia" w:eastAsiaTheme="majorEastAsia" w:cstheme="majorEastAsia"/>
+        <w:t>1.</w:t>
+      </w:r>
+      <w:r>
+        <w:rPr>
+          <w:rStyle w:val="9"/>
+          <w:rFonts w:hint="eastAsia" w:asciiTheme="minorEastAsia" w:hAnsiTheme="minorEastAsia" w:eastAsiaTheme="minorEastAsia" w:cstheme="minorEastAsia"/>
+          <w:b w:val="0"/>
+          <w:bCs/>
           <w:sz w:val="24"/>
           <w:szCs w:val="32"/>
         </w:rPr>
-      </w:pPr>
-      <w:r>
-        <w:rPr>
-          <w:rFonts w:hint="eastAsia" w:asciiTheme="majorEastAsia" w:hAnsiTheme="majorEastAsia" w:eastAsiaTheme="majorEastAsia" w:cstheme="majorEastAsia"/>
+        <w:t>技术学习</w:t>
+      </w:r>
+      <w:r>
+        <w:rPr>
+          <w:rFonts w:hint="eastAsia" w:asciiTheme="minorEastAsia" w:hAnsiTheme="minorEastAsia" w:eastAsiaTheme="minorEastAsia" w:cstheme="minorEastAsia"/>
+          <w:b w:val="0"/>
+          <w:bCs/>
           <w:sz w:val="24"/>
           <w:szCs w:val="32"/>
         </w:rPr>
-        <w:t>核心代码：玩家控制、碰撞检测、状态机模块；</w:t>
-      </w:r>
-    </w:p>
-    <w:p>
-      <w:pPr>
-        <w:keepNext w:val="0"/>
-        <w:keepLines w:val="0"/>
-        <w:widowControl/>
-        <w:numPr>
-          <w:ilvl w:val="0"/>
-          <w:numId w:val="6"/>
-        </w:numPr>
-        <w:suppressLineNumbers w:val="0"/>
-        <w:spacing w:before="0" w:beforeAutospacing="1" w:after="0" w:afterAutospacing="1" w:line="360" w:lineRule="auto"/>
-        <w:ind w:left="360" w:leftChars="0" w:hanging="360" w:firstLineChars="0"/>
-        <w:rPr>
-          <w:rFonts w:hint="eastAsia" w:asciiTheme="majorEastAsia" w:hAnsiTheme="majorEastAsia" w:eastAsiaTheme="majorEastAsia" w:cstheme="majorEastAsia"/>
+        <w:t>：GitHub/Gitee 使用教程、C++ 游戏开发库学习与选型文档；</w:t>
+      </w:r>
+    </w:p>
+    <w:p>
+      <w:pPr>
+        <w:keepNext w:val="0"/>
+        <w:keepLines w:val="0"/>
+        <w:widowControl/>
+        <w:suppressLineNumbers w:val="0"/>
+        <w:spacing w:line="360" w:lineRule="auto"/>
+        <w:rPr>
+          <w:rFonts w:hint="eastAsia" w:asciiTheme="minorEastAsia" w:hAnsiTheme="minorEastAsia" w:eastAsiaTheme="minorEastAsia" w:cstheme="minorEastAsia"/>
+          <w:b w:val="0"/>
+          <w:bCs/>
           <w:sz w:val="24"/>
           <w:szCs w:val="32"/>
         </w:rPr>
       </w:pPr>
       <w:r>
         <w:rPr>
-          <w:rFonts w:hint="eastAsia" w:asciiTheme="majorEastAsia" w:hAnsiTheme="majorEastAsia" w:eastAsiaTheme="majorEastAsia" w:cstheme="majorEastAsia"/>
+          <w:rStyle w:val="9"/>
+          <w:rFonts w:hint="eastAsia" w:asciiTheme="minorEastAsia" w:hAnsiTheme="minorEastAsia" w:eastAsiaTheme="minorEastAsia" w:cstheme="minorEastAsia"/>
+          <w:b w:val="0"/>
+          <w:bCs/>
           <w:sz w:val="24"/>
           <w:szCs w:val="32"/>
-        </w:rPr>
-        <w:t>特效代码：粒子爆炸、光影效果；</w:t>
-      </w:r>
-    </w:p>
-    <w:p>
-      <w:pPr>
-        <w:keepNext w:val="0"/>
-        <w:keepLines w:val="0"/>
-        <w:widowControl/>
-        <w:numPr>
-          <w:ilvl w:val="0"/>
-          <w:numId w:val="6"/>
-        </w:numPr>
-        <w:suppressLineNumbers w:val="0"/>
-        <w:spacing w:before="0" w:beforeAutospacing="1" w:after="0" w:afterAutospacing="1" w:line="360" w:lineRule="auto"/>
-        <w:ind w:left="360" w:leftChars="0" w:hanging="360" w:firstLineChars="0"/>
-        <w:rPr>
-          <w:rFonts w:hint="eastAsia" w:asciiTheme="majorEastAsia" w:hAnsiTheme="majorEastAsia" w:eastAsiaTheme="majorEastAsia" w:cstheme="majorEastAsia"/>
+          <w:lang w:val="en-US" w:eastAsia="zh-CN"/>
+        </w:rPr>
+        <w:t>2.</w:t>
+      </w:r>
+      <w:r>
+        <w:rPr>
+          <w:rStyle w:val="9"/>
+          <w:rFonts w:hint="eastAsia" w:asciiTheme="minorEastAsia" w:hAnsiTheme="minorEastAsia" w:eastAsiaTheme="minorEastAsia" w:cstheme="minorEastAsia"/>
+          <w:b w:val="0"/>
+          <w:bCs/>
           <w:sz w:val="24"/>
           <w:szCs w:val="32"/>
         </w:rPr>
-      </w:pPr>
-      <w:r>
-        <w:rPr>
-          <w:rFonts w:hint="eastAsia" w:asciiTheme="majorEastAsia" w:hAnsiTheme="majorEastAsia" w:eastAsiaTheme="majorEastAsia" w:cstheme="majorEastAsia"/>
+        <w:t>美术资源</w:t>
+      </w:r>
+      <w:r>
+        <w:rPr>
+          <w:rFonts w:hint="eastAsia" w:asciiTheme="minorEastAsia" w:hAnsiTheme="minorEastAsia" w:eastAsiaTheme="minorEastAsia" w:cstheme="minorEastAsia"/>
+          <w:b w:val="0"/>
+          <w:bCs/>
           <w:sz w:val="24"/>
           <w:szCs w:val="32"/>
         </w:rPr>
-        <w:t>实验报告：全文撰写与排版。</w:t>
+        <w:t>：游戏角色、敌人、道具、UI 界面的图片素材设计与生成；</w:t>
       </w:r>
     </w:p>
     <w:p>
@@ -4772,6 +6094,8 @@
         </w:rPr>
         <w:t>收获</w:t>
       </w:r>
+      <w:bookmarkStart w:id="2" w:name="_GoBack"/>
+      <w:bookmarkEnd w:id="2"/>
     </w:p>
     <w:p>
       <w:pPr>
@@ -4922,35 +6246,35 @@
           <w:szCs w:val="24"/>
           <w:lang w:val="en-US" w:eastAsia="zh-CN" w:bidi="ar"/>
         </w:rPr>
-        <w:t>3．问题排查与调试能力</w:t>
-      </w:r>
-    </w:p>
-    <w:p>
-      <w:pPr>
-        <w:keepNext w:val="0"/>
-        <w:keepLines w:val="0"/>
-        <w:widowControl/>
-        <w:suppressLineNumbers w:val="0"/>
-        <w:bidi w:val="0"/>
-        <w:spacing w:line="360" w:lineRule="auto"/>
-        <w:jc w:val="left"/>
-        <w:rPr>
-          <w:rFonts w:hint="eastAsia" w:asciiTheme="majorEastAsia" w:hAnsiTheme="majorEastAsia" w:eastAsiaTheme="majorEastAsia" w:cstheme="majorEastAsia"/>
-          <w:kern w:val="0"/>
-          <w:sz w:val="24"/>
-          <w:szCs w:val="24"/>
-          <w:lang w:val="en-US" w:eastAsia="zh-CN" w:bidi="ar"/>
-        </w:rPr>
-      </w:pPr>
-      <w:r>
-        <w:rPr>
-          <w:rFonts w:hint="eastAsia" w:asciiTheme="majorEastAsia" w:hAnsiTheme="majorEastAsia" w:eastAsiaTheme="majorEastAsia" w:cstheme="majorEastAsia"/>
-          <w:kern w:val="0"/>
-          <w:sz w:val="24"/>
-          <w:szCs w:val="24"/>
-          <w:lang w:val="en-US" w:eastAsia="zh-CN" w:bidi="ar"/>
-        </w:rPr>
-        <w:t>在测试中发现碰撞失效、生成频率异常等问题，学会通过日志、断点调试定位并修复 bug，提升了程序调试与问题解决能力。</w:t>
+        <w:t>3．工程化与项目管理</w:t>
+      </w:r>
+    </w:p>
+    <w:p>
+      <w:pPr>
+        <w:keepNext w:val="0"/>
+        <w:keepLines w:val="0"/>
+        <w:widowControl/>
+        <w:suppressLineNumbers w:val="0"/>
+        <w:bidi w:val="0"/>
+        <w:spacing w:line="360" w:lineRule="auto"/>
+        <w:jc w:val="left"/>
+        <w:rPr>
+          <w:rFonts w:hint="eastAsia" w:asciiTheme="majorEastAsia" w:hAnsiTheme="majorEastAsia" w:eastAsiaTheme="majorEastAsia" w:cstheme="majorEastAsia"/>
+          <w:kern w:val="0"/>
+          <w:sz w:val="24"/>
+          <w:szCs w:val="24"/>
+          <w:lang w:val="en-US" w:eastAsia="zh-CN" w:bidi="ar"/>
+        </w:rPr>
+      </w:pPr>
+      <w:r>
+        <w:rPr>
+          <w:rFonts w:hint="eastAsia" w:asciiTheme="majorEastAsia" w:hAnsiTheme="majorEastAsia" w:eastAsiaTheme="majorEastAsia" w:cstheme="majorEastAsia"/>
+          <w:kern w:val="0"/>
+          <w:sz w:val="24"/>
+          <w:szCs w:val="24"/>
+          <w:lang w:val="en-US" w:eastAsia="zh-CN" w:bidi="ar"/>
+        </w:rPr>
+        <w:t>学会使用 GitHub/Gitee 进行代码托管、版本管理，理解工程化开发流程，能够规范管理项目文件与资源。</w:t>
       </w:r>
     </w:p>
     <w:p>
@@ -4982,35 +6306,35 @@
           <w:szCs w:val="24"/>
           <w:lang w:val="en-US" w:eastAsia="zh-CN" w:bidi="ar"/>
         </w:rPr>
-        <w:t>4．代码规范与工程化</w:t>
-      </w:r>
-    </w:p>
-    <w:p>
-      <w:pPr>
-        <w:keepNext w:val="0"/>
-        <w:keepLines w:val="0"/>
-        <w:widowControl/>
-        <w:suppressLineNumbers w:val="0"/>
-        <w:bidi w:val="0"/>
-        <w:spacing w:line="360" w:lineRule="auto"/>
-        <w:jc w:val="left"/>
-        <w:rPr>
-          <w:rFonts w:hint="eastAsia" w:asciiTheme="majorEastAsia" w:hAnsiTheme="majorEastAsia" w:eastAsiaTheme="majorEastAsia" w:cstheme="majorEastAsia"/>
-          <w:kern w:val="0"/>
-          <w:sz w:val="24"/>
-          <w:szCs w:val="24"/>
-          <w:lang w:val="en-US" w:eastAsia="zh-CN" w:bidi="ar"/>
-        </w:rPr>
-      </w:pPr>
-      <w:r>
-        <w:rPr>
-          <w:rFonts w:hint="eastAsia" w:asciiTheme="majorEastAsia" w:hAnsiTheme="majorEastAsia" w:eastAsiaTheme="majorEastAsia" w:cstheme="majorEastAsia"/>
-          <w:kern w:val="0"/>
-          <w:sz w:val="24"/>
-          <w:szCs w:val="24"/>
-          <w:lang w:val="en-US" w:eastAsia="zh-CN" w:bidi="ar"/>
-        </w:rPr>
-        <w:t>使用 CMake 构建项目，规范代码结构与命名规则，理解大型项目模块化、工程化开发的重要性。</w:t>
+        <w:t>4．资源制作与全流程开发</w:t>
+      </w:r>
+    </w:p>
+    <w:p>
+      <w:pPr>
+        <w:keepNext w:val="0"/>
+        <w:keepLines w:val="0"/>
+        <w:widowControl/>
+        <w:suppressLineNumbers w:val="0"/>
+        <w:bidi w:val="0"/>
+        <w:spacing w:line="360" w:lineRule="auto"/>
+        <w:jc w:val="left"/>
+        <w:rPr>
+          <w:rFonts w:hint="eastAsia" w:asciiTheme="majorEastAsia" w:hAnsiTheme="majorEastAsia" w:eastAsiaTheme="majorEastAsia" w:cstheme="majorEastAsia"/>
+          <w:kern w:val="0"/>
+          <w:sz w:val="24"/>
+          <w:szCs w:val="24"/>
+          <w:lang w:val="en-US" w:eastAsia="zh-CN" w:bidi="ar"/>
+        </w:rPr>
+      </w:pPr>
+      <w:r>
+        <w:rPr>
+          <w:rFonts w:hint="eastAsia" w:asciiTheme="majorEastAsia" w:hAnsiTheme="majorEastAsia" w:eastAsiaTheme="majorEastAsia" w:cstheme="majorEastAsia"/>
+          <w:kern w:val="0"/>
+          <w:sz w:val="24"/>
+          <w:szCs w:val="24"/>
+          <w:lang w:val="en-US" w:eastAsia="zh-CN" w:bidi="ar"/>
+        </w:rPr>
+        <w:t>独立完成从技术选型、代码编写、美术资源设计到程序调试、测试的完整游戏开发流程，具备全栈开发思维。</w:t>
       </w:r>
     </w:p>
     <w:p>
@@ -5042,31 +6366,95 @@
           <w:szCs w:val="24"/>
           <w:lang w:val="en-US" w:eastAsia="zh-CN" w:bidi="ar"/>
         </w:rPr>
-        <w:t>5．AI 工具的合理使用</w:t>
-      </w:r>
-    </w:p>
-    <w:p>
-      <w:pPr>
-        <w:keepNext w:val="0"/>
-        <w:keepLines w:val="0"/>
-        <w:widowControl/>
-        <w:suppressLineNumbers w:val="0"/>
-        <w:bidi w:val="0"/>
-        <w:spacing w:line="360" w:lineRule="auto"/>
-        <w:jc w:val="left"/>
-        <w:rPr>
-          <w:rFonts w:hint="eastAsia" w:asciiTheme="majorEastAsia" w:hAnsiTheme="majorEastAsia" w:eastAsiaTheme="majorEastAsia" w:cstheme="majorEastAsia"/>
-        </w:rPr>
-      </w:pPr>
-      <w:r>
-        <w:rPr>
-          <w:rFonts w:hint="eastAsia" w:asciiTheme="majorEastAsia" w:hAnsiTheme="majorEastAsia" w:eastAsiaTheme="majorEastAsia" w:cstheme="majorEastAsia"/>
-          <w:kern w:val="0"/>
-          <w:sz w:val="24"/>
-          <w:szCs w:val="24"/>
-          <w:lang w:val="en-US" w:eastAsia="zh-CN" w:bidi="ar"/>
-        </w:rPr>
-        <w:t>AI 工具能快速提供开发思路与代码示例，大幅提升开发效率，但必须结合自身知识验证代码逻辑，培养了独立思考与甄别优化的能力。</w:t>
+        <w:t>5．问题排查与调试能力</w:t>
+      </w:r>
+    </w:p>
+    <w:p>
+      <w:pPr>
+        <w:keepNext w:val="0"/>
+        <w:keepLines w:val="0"/>
+        <w:widowControl/>
+        <w:suppressLineNumbers w:val="0"/>
+        <w:bidi w:val="0"/>
+        <w:spacing w:line="360" w:lineRule="auto"/>
+        <w:jc w:val="left"/>
+        <w:rPr>
+          <w:rFonts w:hint="eastAsia" w:asciiTheme="majorEastAsia" w:hAnsiTheme="majorEastAsia" w:eastAsiaTheme="majorEastAsia" w:cstheme="majorEastAsia"/>
+          <w:kern w:val="0"/>
+          <w:sz w:val="24"/>
+          <w:szCs w:val="24"/>
+          <w:lang w:val="en-US" w:eastAsia="zh-CN" w:bidi="ar"/>
+        </w:rPr>
+      </w:pPr>
+      <w:r>
+        <w:rPr>
+          <w:rFonts w:hint="eastAsia" w:asciiTheme="majorEastAsia" w:hAnsiTheme="majorEastAsia" w:eastAsiaTheme="majorEastAsia" w:cstheme="majorEastAsia"/>
+          <w:kern w:val="0"/>
+          <w:sz w:val="24"/>
+          <w:szCs w:val="24"/>
+          <w:lang w:val="en-US" w:eastAsia="zh-CN" w:bidi="ar"/>
+        </w:rPr>
+        <w:t>在测试中发现碰撞失效、生成频率异常、资源加载失败等问题，学会通过日志、断点调试定位并修复 bug，提升了程序调试与问题解决能力。</w:t>
+      </w:r>
+    </w:p>
+    <w:p>
+      <w:pPr>
+        <w:keepNext w:val="0"/>
+        <w:keepLines w:val="0"/>
+        <w:widowControl/>
+        <w:suppressLineNumbers w:val="0"/>
+        <w:bidi w:val="0"/>
+        <w:spacing w:line="360" w:lineRule="auto"/>
+        <w:jc w:val="left"/>
+        <w:rPr>
+          <w:rFonts w:hint="eastAsia" w:asciiTheme="majorEastAsia" w:hAnsiTheme="majorEastAsia" w:eastAsiaTheme="majorEastAsia" w:cstheme="majorEastAsia"/>
+          <w:b/>
+          <w:bCs/>
+          <w:kern w:val="0"/>
+          <w:sz w:val="24"/>
+          <w:szCs w:val="24"/>
+          <w:lang w:val="en-US" w:eastAsia="zh-CN" w:bidi="ar"/>
+        </w:rPr>
+      </w:pPr>
+      <w:r>
+        <w:rPr>
+          <w:rFonts w:hint="eastAsia" w:asciiTheme="majorEastAsia" w:hAnsiTheme="majorEastAsia" w:eastAsiaTheme="majorEastAsia" w:cstheme="majorEastAsia"/>
+          <w:b/>
+          <w:bCs/>
+          <w:kern w:val="0"/>
+          <w:sz w:val="24"/>
+          <w:szCs w:val="24"/>
+          <w:lang w:val="en-US" w:eastAsia="zh-CN" w:bidi="ar"/>
+        </w:rPr>
+        <w:t>6．AI 工具的合理使用</w:t>
+      </w:r>
+    </w:p>
+    <w:p>
+      <w:pPr>
+        <w:keepNext w:val="0"/>
+        <w:keepLines w:val="0"/>
+        <w:widowControl/>
+        <w:suppressLineNumbers w:val="0"/>
+        <w:bidi w:val="0"/>
+        <w:spacing w:line="360" w:lineRule="auto"/>
+        <w:jc w:val="left"/>
+        <w:rPr>
+          <w:rFonts w:hint="eastAsia" w:asciiTheme="majorEastAsia" w:hAnsiTheme="majorEastAsia" w:eastAsiaTheme="majorEastAsia" w:cstheme="majorEastAsia"/>
+          <w:kern w:val="0"/>
+          <w:sz w:val="24"/>
+          <w:szCs w:val="24"/>
+          <w:lang w:val="en-US" w:eastAsia="zh-CN" w:bidi="ar"/>
+        </w:rPr>
+      </w:pPr>
+      <w:r>
+        <w:rPr>
+          <w:rFonts w:hint="eastAsia" w:asciiTheme="majorEastAsia" w:hAnsiTheme="majorEastAsia" w:eastAsiaTheme="majorEastAsia" w:cstheme="majorEastAsia"/>
+          <w:kern w:val="0"/>
+          <w:sz w:val="24"/>
+          <w:szCs w:val="24"/>
+          <w:lang w:val="en-US" w:eastAsia="zh-CN" w:bidi="ar"/>
+        </w:rPr>
+        <w:t>AI 工具能快速提供学习资料、开发思路、代码示例和美术方案，大幅提升开发效率，但必须结合自身知识验证代码逻辑，培养了独立思考与甄别优化的能力。</w:t>
       </w:r>
     </w:p>
     <w:p>
@@ -5400,9 +6788,9 @@
     </w:lvl>
   </w:abstractNum>
   <w:abstractNum w:abstractNumId="3">
-    <w:nsid w:val="01504FE1"/>
+    <w:nsid w:val="13123AA7"/>
     <w:multiLevelType w:val="multilevel"/>
-    <w:tmpl w:val="01504FE1"/>
+    <w:tmpl w:val="13123AA7"/>
     <w:lvl w:ilvl="0" w:tentative="0">
       <w:start w:val="1"/>
       <w:numFmt w:val="decimal"/>
@@ -5412,7 +6800,7 @@
         <w:tabs>
           <w:tab w:val="left" w:pos="720"/>
         </w:tabs>
-        <w:ind w:left="360" w:hanging="360"/>
+        <w:ind w:left="720" w:hanging="360"/>
       </w:pPr>
       <w:rPr>
         <w:sz w:val="24"/>
@@ -5549,152 +6937,20 @@
     </w:lvl>
   </w:abstractNum>
   <w:abstractNum w:abstractNumId="4">
-    <w:nsid w:val="13123AA7"/>
-    <w:multiLevelType w:val="multilevel"/>
-    <w:tmpl w:val="13123AA7"/>
+    <w:nsid w:val="39AE502C"/>
+    <w:multiLevelType w:val="singleLevel"/>
+    <w:tmpl w:val="39AE502C"/>
     <w:lvl w:ilvl="0" w:tentative="0">
-      <w:start w:val="1"/>
-      <w:numFmt w:val="decimal"/>
+      <w:start w:val="3"/>
+      <w:numFmt w:val="upperLetter"/>
       <w:lvlText w:val="%1."/>
       <w:lvlJc w:val="left"/>
       <w:pPr>
         <w:tabs>
-          <w:tab w:val="left" w:pos="720"/>
+          <w:tab w:val="left" w:pos="312"/>
         </w:tabs>
-        <w:ind w:left="720" w:hanging="360"/>
-      </w:pPr>
-      <w:rPr>
-        <w:sz w:val="24"/>
-        <w:szCs w:val="24"/>
-      </w:rPr>
-    </w:lvl>
-    <w:lvl w:ilvl="1" w:tentative="0">
-      <w:start w:val="1"/>
-      <w:numFmt w:val="decimal"/>
-      <w:lvlText w:val="%2."/>
-      <w:lvlJc w:val="left"/>
-      <w:pPr>
-        <w:tabs>
-          <w:tab w:val="left" w:pos="1440"/>
-        </w:tabs>
-        <w:ind w:left="1440" w:hanging="360"/>
-      </w:pPr>
-      <w:rPr>
-        <w:sz w:val="24"/>
-        <w:szCs w:val="24"/>
-      </w:rPr>
-    </w:lvl>
-    <w:lvl w:ilvl="2" w:tentative="0">
-      <w:start w:val="1"/>
-      <w:numFmt w:val="decimal"/>
-      <w:lvlText w:val="%3."/>
-      <w:lvlJc w:val="left"/>
-      <w:pPr>
-        <w:tabs>
-          <w:tab w:val="left" w:pos="2160"/>
-        </w:tabs>
-        <w:ind w:left="2160" w:hanging="360"/>
-      </w:pPr>
-      <w:rPr>
-        <w:sz w:val="24"/>
-        <w:szCs w:val="24"/>
-      </w:rPr>
-    </w:lvl>
-    <w:lvl w:ilvl="3" w:tentative="0">
-      <w:start w:val="1"/>
-      <w:numFmt w:val="decimal"/>
-      <w:lvlText w:val="%4."/>
-      <w:lvlJc w:val="left"/>
-      <w:pPr>
-        <w:tabs>
-          <w:tab w:val="left" w:pos="2517"/>
-        </w:tabs>
-        <w:ind w:left="2880" w:hanging="360"/>
-      </w:pPr>
-      <w:rPr>
-        <w:sz w:val="24"/>
-        <w:szCs w:val="24"/>
-      </w:rPr>
-    </w:lvl>
-    <w:lvl w:ilvl="4" w:tentative="0">
-      <w:start w:val="1"/>
-      <w:numFmt w:val="decimal"/>
-      <w:lvlText w:val="%5."/>
-      <w:lvlJc w:val="left"/>
-      <w:pPr>
-        <w:tabs>
-          <w:tab w:val="left" w:pos="3238"/>
-        </w:tabs>
-        <w:ind w:left="3600" w:hanging="360"/>
-      </w:pPr>
-      <w:rPr>
-        <w:sz w:val="24"/>
-        <w:szCs w:val="24"/>
-      </w:rPr>
-    </w:lvl>
-    <w:lvl w:ilvl="5" w:tentative="0">
-      <w:start w:val="1"/>
-      <w:numFmt w:val="decimal"/>
-      <w:lvlText w:val="%6."/>
-      <w:lvlJc w:val="left"/>
-      <w:pPr>
-        <w:tabs>
-          <w:tab w:val="left" w:pos="3958"/>
-        </w:tabs>
-        <w:ind w:left="4320" w:hanging="360"/>
-      </w:pPr>
-      <w:rPr>
-        <w:sz w:val="24"/>
-        <w:szCs w:val="24"/>
-      </w:rPr>
-    </w:lvl>
-    <w:lvl w:ilvl="6" w:tentative="0">
-      <w:start w:val="1"/>
-      <w:numFmt w:val="decimal"/>
-      <w:lvlText w:val="%7."/>
-      <w:lvlJc w:val="left"/>
-      <w:pPr>
-        <w:tabs>
-          <w:tab w:val="left" w:pos="4678"/>
-        </w:tabs>
-        <w:ind w:left="5040" w:hanging="360"/>
-      </w:pPr>
-      <w:rPr>
-        <w:sz w:val="24"/>
-        <w:szCs w:val="24"/>
-      </w:rPr>
-    </w:lvl>
-    <w:lvl w:ilvl="7" w:tentative="0">
-      <w:start w:val="1"/>
-      <w:numFmt w:val="decimal"/>
-      <w:lvlText w:val="%8."/>
-      <w:lvlJc w:val="left"/>
-      <w:pPr>
-        <w:tabs>
-          <w:tab w:val="left" w:pos="5398"/>
-        </w:tabs>
-        <w:ind w:left="5760" w:hanging="360"/>
-      </w:pPr>
-      <w:rPr>
-        <w:sz w:val="24"/>
-        <w:szCs w:val="24"/>
-      </w:rPr>
-    </w:lvl>
-    <w:lvl w:ilvl="8" w:tentative="0">
-      <w:start w:val="1"/>
-      <w:numFmt w:val="decimal"/>
-      <w:lvlText w:val="%9."/>
-      <w:lvlJc w:val="left"/>
-      <w:pPr>
-        <w:tabs>
-          <w:tab w:val="left" w:pos="6118"/>
-        </w:tabs>
-        <w:ind w:left="6480" w:hanging="360"/>
-      </w:pPr>
-      <w:rPr>
-        <w:sz w:val="24"/>
-        <w:szCs w:val="24"/>
-      </w:rPr>
+        <w:ind w:left="480" w:leftChars="0" w:firstLine="0" w:firstLineChars="0"/>
+      </w:pPr>
     </w:lvl>
   </w:abstractNum>
   <w:abstractNum w:abstractNumId="5">
@@ -5710,6 +6966,23 @@
         <w:tabs>
           <w:tab w:val="left" w:pos="312"/>
         </w:tabs>
+      </w:pPr>
+    </w:lvl>
+  </w:abstractNum>
+  <w:abstractNum w:abstractNumId="6">
+    <w:nsid w:val="4B183DC7"/>
+    <w:multiLevelType w:val="singleLevel"/>
+    <w:tmpl w:val="4B183DC7"/>
+    <w:lvl w:ilvl="0" w:tentative="0">
+      <w:start w:val="4"/>
+      <w:numFmt w:val="upperLetter"/>
+      <w:lvlText w:val="%1."/>
+      <w:lvlJc w:val="left"/>
+      <w:pPr>
+        <w:tabs>
+          <w:tab w:val="left" w:pos="312"/>
+        </w:tabs>
+        <w:ind w:left="480" w:leftChars="0" w:firstLine="0" w:firstLineChars="0"/>
       </w:pPr>
     </w:lvl>
   </w:abstractNum>
@@ -5723,12 +6996,15 @@
     <w:abstractNumId w:val="2"/>
   </w:num>
   <w:num w:numId="4">
+    <w:abstractNumId w:val="4"/>
+  </w:num>
+  <w:num w:numId="5">
+    <w:abstractNumId w:val="6"/>
+  </w:num>
+  <w:num w:numId="6">
     <w:abstractNumId w:val="5"/>
   </w:num>
-  <w:num w:numId="5">
-    <w:abstractNumId w:val="4"/>
-  </w:num>
-  <w:num w:numId="6">
+  <w:num w:numId="7">
     <w:abstractNumId w:val="3"/>
   </w:num>
 </w:numbering>

</xml_diff>